<commit_message>
commiteado con indice actualizado
</commit_message>
<xml_diff>
--- a/Trabajo_Final/Trabajo Final R1-BORQUEZ-RAYES - juan.docx
+++ b/Trabajo_Final/Trabajo Final R1-BORQUEZ-RAYES - juan.docx
@@ -651,7 +651,7 @@
           <w:r>
             <w:fldChar w:fldCharType="separate"/>
           </w:r>
-          <w:hyperlink w:anchor="_Toc181560474" w:history="1">
+          <w:hyperlink w:anchor="_Toc181571768" w:history="1">
             <w:r>
               <w:rPr>
                 <w:rStyle w:val="Hipervnculo"/>
@@ -689,7 +689,7 @@
               <w:rPr>
                 <w:webHidden/>
               </w:rPr>
-              <w:instrText xml:space="preserve"> PAGEREF _Toc181560474 \h </w:instrText>
+              <w:instrText xml:space="preserve"> PAGEREF _Toc181571768 \h </w:instrText>
             </w:r>
             <w:r>
               <w:rPr>
@@ -728,12 +728,12 @@
               <w:sz w:val="22"/>
             </w:rPr>
           </w:pPr>
-          <w:hyperlink w:anchor="_Toc181560475" w:history="1">
+          <w:hyperlink w:anchor="_Toc181571769" w:history="1">
             <w:r>
               <w:rPr>
                 <w:rStyle w:val="Hipervnculo"/>
                 <w:noProof/>
-                <w:lang w:val="es-ES"/>
+                <w:lang w:val="en-GB"/>
               </w:rPr>
               <w:t>Abstract</w:t>
             </w:r>
@@ -756,7 +756,7 @@
                 <w:noProof/>
                 <w:webHidden/>
               </w:rPr>
-              <w:instrText xml:space="preserve"> PAGEREF _Toc181560475 \h </w:instrText>
+              <w:instrText xml:space="preserve"> PAGEREF _Toc181571769 \h </w:instrText>
             </w:r>
             <w:r>
               <w:rPr>
@@ -800,7 +800,7 @@
               <w:lang w:val="en-US"/>
             </w:rPr>
           </w:pPr>
-          <w:hyperlink w:anchor="_Toc181560476" w:history="1">
+          <w:hyperlink w:anchor="_Toc181571770" w:history="1">
             <w:r>
               <w:rPr>
                 <w:rStyle w:val="Hipervnculo"/>
@@ -838,7 +838,7 @@
               <w:rPr>
                 <w:webHidden/>
               </w:rPr>
-              <w:instrText xml:space="preserve"> PAGEREF _Toc181560476 \h </w:instrText>
+              <w:instrText xml:space="preserve"> PAGEREF _Toc181571770 \h </w:instrText>
             </w:r>
             <w:r>
               <w:rPr>
@@ -878,7 +878,7 @@
               <w:lang w:val="en-US"/>
             </w:rPr>
           </w:pPr>
-          <w:hyperlink w:anchor="_Toc181560477" w:history="1">
+          <w:hyperlink w:anchor="_Toc181571771" w:history="1">
             <w:r>
               <w:rPr>
                 <w:rStyle w:val="Hipervnculo"/>
@@ -916,7 +916,7 @@
               <w:rPr>
                 <w:webHidden/>
               </w:rPr>
-              <w:instrText xml:space="preserve"> PAGEREF _Toc181560477 \h </w:instrText>
+              <w:instrText xml:space="preserve"> PAGEREF _Toc181571771 \h </w:instrText>
             </w:r>
             <w:r>
               <w:rPr>
@@ -956,7 +956,7 @@
               <w:sz w:val="22"/>
             </w:rPr>
           </w:pPr>
-          <w:hyperlink w:anchor="_Toc181560478" w:history="1">
+          <w:hyperlink w:anchor="_Toc181571772" w:history="1">
             <w:r>
               <w:rPr>
                 <w:rStyle w:val="Hipervnculo"/>
@@ -1000,7 +1000,7 @@
                 <w:noProof/>
                 <w:webHidden/>
               </w:rPr>
-              <w:instrText xml:space="preserve"> PAGEREF _Toc181560478 \h </w:instrText>
+              <w:instrText xml:space="preserve"> PAGEREF _Toc181571772 \h </w:instrText>
             </w:r>
             <w:r>
               <w:rPr>
@@ -1044,7 +1044,7 @@
               <w:sz w:val="22"/>
             </w:rPr>
           </w:pPr>
-          <w:hyperlink w:anchor="_Toc181560479" w:history="1">
+          <w:hyperlink w:anchor="_Toc181571773" w:history="1">
             <w:r>
               <w:rPr>
                 <w:rStyle w:val="Hipervnculo"/>
@@ -1088,7 +1088,7 @@
                 <w:noProof/>
                 <w:webHidden/>
               </w:rPr>
-              <w:instrText xml:space="preserve"> PAGEREF _Toc181560479 \h </w:instrText>
+              <w:instrText xml:space="preserve"> PAGEREF _Toc181571773 \h </w:instrText>
             </w:r>
             <w:r>
               <w:rPr>
@@ -1132,7 +1132,7 @@
               <w:sz w:val="22"/>
             </w:rPr>
           </w:pPr>
-          <w:hyperlink w:anchor="_Toc181560480" w:history="1">
+          <w:hyperlink w:anchor="_Toc181571774" w:history="1">
             <w:r>
               <w:rPr>
                 <w:rStyle w:val="Hipervnculo"/>
@@ -1176,7 +1176,7 @@
                 <w:noProof/>
                 <w:webHidden/>
               </w:rPr>
-              <w:instrText xml:space="preserve"> PAGEREF _Toc181560480 \h </w:instrText>
+              <w:instrText xml:space="preserve"> PAGEREF _Toc181571774 \h </w:instrText>
             </w:r>
             <w:r>
               <w:rPr>
@@ -1220,7 +1220,7 @@
               <w:sz w:val="22"/>
             </w:rPr>
           </w:pPr>
-          <w:hyperlink w:anchor="_Toc181560481" w:history="1">
+          <w:hyperlink w:anchor="_Toc181571775" w:history="1">
             <w:r>
               <w:rPr>
                 <w:rStyle w:val="Hipervnculo"/>
@@ -1264,7 +1264,7 @@
                 <w:noProof/>
                 <w:webHidden/>
               </w:rPr>
-              <w:instrText xml:space="preserve"> PAGEREF _Toc181560481 \h </w:instrText>
+              <w:instrText xml:space="preserve"> PAGEREF _Toc181571775 \h </w:instrText>
             </w:r>
             <w:r>
               <w:rPr>
@@ -1308,7 +1308,7 @@
               <w:sz w:val="22"/>
             </w:rPr>
           </w:pPr>
-          <w:hyperlink w:anchor="_Toc181560482" w:history="1">
+          <w:hyperlink w:anchor="_Toc181571776" w:history="1">
             <w:r>
               <w:rPr>
                 <w:rStyle w:val="Hipervnculo"/>
@@ -1352,7 +1352,7 @@
                 <w:noProof/>
                 <w:webHidden/>
               </w:rPr>
-              <w:instrText xml:space="preserve"> PAGEREF _Toc181560482 \h </w:instrText>
+              <w:instrText xml:space="preserve"> PAGEREF _Toc181571776 \h </w:instrText>
             </w:r>
             <w:r>
               <w:rPr>
@@ -1396,7 +1396,7 @@
               <w:sz w:val="22"/>
             </w:rPr>
           </w:pPr>
-          <w:hyperlink w:anchor="_Toc181560483" w:history="1">
+          <w:hyperlink w:anchor="_Toc181571777" w:history="1">
             <w:r>
               <w:rPr>
                 <w:rStyle w:val="Hipervnculo"/>
@@ -1440,7 +1440,7 @@
                 <w:noProof/>
                 <w:webHidden/>
               </w:rPr>
-              <w:instrText xml:space="preserve"> PAGEREF _Toc181560483 \h </w:instrText>
+              <w:instrText xml:space="preserve"> PAGEREF _Toc181571777 \h </w:instrText>
             </w:r>
             <w:r>
               <w:rPr>
@@ -1484,7 +1484,7 @@
               <w:sz w:val="22"/>
             </w:rPr>
           </w:pPr>
-          <w:hyperlink w:anchor="_Toc181560484" w:history="1">
+          <w:hyperlink w:anchor="_Toc181571778" w:history="1">
             <w:r>
               <w:rPr>
                 <w:rStyle w:val="Hipervnculo"/>
@@ -1528,7 +1528,7 @@
                 <w:noProof/>
                 <w:webHidden/>
               </w:rPr>
-              <w:instrText xml:space="preserve"> PAGEREF _Toc181560484 \h </w:instrText>
+              <w:instrText xml:space="preserve"> PAGEREF _Toc181571778 \h </w:instrText>
             </w:r>
             <w:r>
               <w:rPr>
@@ -1572,14 +1572,14 @@
               <w:sz w:val="22"/>
             </w:rPr>
           </w:pPr>
-          <w:hyperlink w:anchor="_Toc181560485" w:history="1">
+          <w:hyperlink w:anchor="_Toc181571779" w:history="1">
             <w:r>
               <w:rPr>
                 <w:rStyle w:val="Hipervnculo"/>
                 <w:noProof/>
                 <w:lang w:val="es-ES"/>
               </w:rPr>
-              <w:t>3.3.1</w:t>
+              <w:t xml:space="preserve">3.3.2 </w:t>
             </w:r>
             <w:r>
               <w:rPr>
@@ -1593,9 +1593,9 @@
               <w:rPr>
                 <w:rStyle w:val="Hipervnculo"/>
                 <w:noProof/>
-                <w:lang w:val="es-AR"/>
-              </w:rPr>
-              <w:t>Efector final</w:t>
+                <w:lang w:val="es-ES"/>
+              </w:rPr>
+              <w:t>Espacio de trabajo del robot</w:t>
             </w:r>
             <w:r>
               <w:rPr>
@@ -1616,95 +1616,7 @@
                 <w:noProof/>
                 <w:webHidden/>
               </w:rPr>
-              <w:instrText xml:space="preserve"> PAGEREF _Toc181560485 \h </w:instrText>
-            </w:r>
-            <w:r>
-              <w:rPr>
-                <w:noProof/>
-                <w:webHidden/>
-              </w:rPr>
-            </w:r>
-            <w:r>
-              <w:rPr>
-                <w:noProof/>
-                <w:webHidden/>
-              </w:rPr>
-              <w:fldChar w:fldCharType="separate"/>
-            </w:r>
-            <w:r>
-              <w:rPr>
-                <w:noProof/>
-                <w:webHidden/>
-              </w:rPr>
-              <w:t>8</w:t>
-            </w:r>
-            <w:r>
-              <w:rPr>
-                <w:noProof/>
-                <w:webHidden/>
-              </w:rPr>
-              <w:fldChar w:fldCharType="end"/>
-            </w:r>
-          </w:hyperlink>
-        </w:p>
-        <w:p>
-          <w:pPr>
-            <w:pStyle w:val="TDC3"/>
-            <w:tabs>
-              <w:tab w:val="left" w:pos="1540"/>
-              <w:tab w:val="right" w:leader="dot" w:pos="9344"/>
-            </w:tabs>
-            <w:rPr>
-              <w:rFonts w:asciiTheme="minorHAnsi" w:eastAsiaTheme="minorEastAsia" w:hAnsiTheme="minorHAnsi"/>
-              <w:noProof/>
-              <w:sz w:val="22"/>
-            </w:rPr>
-          </w:pPr>
-          <w:hyperlink w:anchor="_Toc181560486" w:history="1">
-            <w:r>
-              <w:rPr>
-                <w:rStyle w:val="Hipervnculo"/>
-                <w:noProof/>
-                <w:lang w:val="es-ES"/>
-              </w:rPr>
-              <w:t xml:space="preserve">3.3.2 </w:t>
-            </w:r>
-            <w:r>
-              <w:rPr>
-                <w:rFonts w:asciiTheme="minorHAnsi" w:eastAsiaTheme="minorEastAsia" w:hAnsiTheme="minorHAnsi"/>
-                <w:noProof/>
-                <w:sz w:val="22"/>
-              </w:rPr>
-              <w:tab/>
-            </w:r>
-            <w:r>
-              <w:rPr>
-                <w:rStyle w:val="Hipervnculo"/>
-                <w:noProof/>
-                <w:lang w:val="es-ES"/>
-              </w:rPr>
-              <w:t>Espacio de trabajo del robot</w:t>
-            </w:r>
-            <w:r>
-              <w:rPr>
-                <w:noProof/>
-                <w:webHidden/>
-              </w:rPr>
-              <w:tab/>
-            </w:r>
-            <w:r>
-              <w:rPr>
-                <w:noProof/>
-                <w:webHidden/>
-              </w:rPr>
-              <w:fldChar w:fldCharType="begin"/>
-            </w:r>
-            <w:r>
-              <w:rPr>
-                <w:noProof/>
-                <w:webHidden/>
-              </w:rPr>
-              <w:instrText xml:space="preserve"> PAGEREF _Toc181560486 \h </w:instrText>
+              <w:instrText xml:space="preserve"> PAGEREF _Toc181571779 \h </w:instrText>
             </w:r>
             <w:r>
               <w:rPr>
@@ -1747,7 +1659,7 @@
               <w:sz w:val="22"/>
             </w:rPr>
           </w:pPr>
-          <w:hyperlink w:anchor="_Toc181560487" w:history="1">
+          <w:hyperlink w:anchor="_Toc181571780" w:history="1">
             <w:r>
               <w:rPr>
                 <w:rStyle w:val="Hipervnculo"/>
@@ -1775,7 +1687,7 @@
                 <w:noProof/>
                 <w:webHidden/>
               </w:rPr>
-              <w:instrText xml:space="preserve"> PAGEREF _Toc181560487 \h </w:instrText>
+              <w:instrText xml:space="preserve"> PAGEREF _Toc181571780 \h </w:instrText>
             </w:r>
             <w:r>
               <w:rPr>
@@ -1819,7 +1731,7 @@
               <w:lang w:val="en-US"/>
             </w:rPr>
           </w:pPr>
-          <w:hyperlink w:anchor="_Toc181560488" w:history="1">
+          <w:hyperlink w:anchor="_Toc181571781" w:history="1">
             <w:r>
               <w:rPr>
                 <w:rStyle w:val="Hipervnculo"/>
@@ -1857,7 +1769,7 @@
               <w:rPr>
                 <w:webHidden/>
               </w:rPr>
-              <w:instrText xml:space="preserve"> PAGEREF _Toc181560488 \h </w:instrText>
+              <w:instrText xml:space="preserve"> PAGEREF _Toc181571781 \h </w:instrText>
             </w:r>
             <w:r>
               <w:rPr>
@@ -1897,7 +1809,7 @@
               <w:sz w:val="22"/>
             </w:rPr>
           </w:pPr>
-          <w:hyperlink w:anchor="_Toc181560489" w:history="1">
+          <w:hyperlink w:anchor="_Toc181571782" w:history="1">
             <w:r>
               <w:rPr>
                 <w:rStyle w:val="Hipervnculo"/>
@@ -1941,7 +1853,7 @@
                 <w:noProof/>
                 <w:webHidden/>
               </w:rPr>
-              <w:instrText xml:space="preserve"> PAGEREF _Toc181560489 \h </w:instrText>
+              <w:instrText xml:space="preserve"> PAGEREF _Toc181571782 \h </w:instrText>
             </w:r>
             <w:r>
               <w:rPr>
@@ -1985,7 +1897,7 @@
               <w:sz w:val="22"/>
             </w:rPr>
           </w:pPr>
-          <w:hyperlink w:anchor="_Toc181560490" w:history="1">
+          <w:hyperlink w:anchor="_Toc181571783" w:history="1">
             <w:r>
               <w:rPr>
                 <w:rStyle w:val="Hipervnculo"/>
@@ -2029,7 +1941,7 @@
                 <w:noProof/>
                 <w:webHidden/>
               </w:rPr>
-              <w:instrText xml:space="preserve"> PAGEREF _Toc181560490 \h </w:instrText>
+              <w:instrText xml:space="preserve"> PAGEREF _Toc181571783 \h </w:instrText>
             </w:r>
             <w:r>
               <w:rPr>
@@ -2073,7 +1985,7 @@
               <w:sz w:val="22"/>
             </w:rPr>
           </w:pPr>
-          <w:hyperlink w:anchor="_Toc181560491" w:history="1">
+          <w:hyperlink w:anchor="_Toc181571784" w:history="1">
             <w:r>
               <w:rPr>
                 <w:rStyle w:val="Hipervnculo"/>
@@ -2117,7 +2029,7 @@
                 <w:noProof/>
                 <w:webHidden/>
               </w:rPr>
-              <w:instrText xml:space="preserve"> PAGEREF _Toc181560491 \h </w:instrText>
+              <w:instrText xml:space="preserve"> PAGEREF _Toc181571784 \h </w:instrText>
             </w:r>
             <w:r>
               <w:rPr>
@@ -2160,7 +2072,7 @@
               <w:sz w:val="22"/>
             </w:rPr>
           </w:pPr>
-          <w:hyperlink w:anchor="_Toc181560492" w:history="1">
+          <w:hyperlink w:anchor="_Toc181571785" w:history="1">
             <w:r>
               <w:rPr>
                 <w:rStyle w:val="Hipervnculo"/>
@@ -2188,7 +2100,7 @@
                 <w:noProof/>
                 <w:webHidden/>
               </w:rPr>
-              <w:instrText xml:space="preserve"> PAGEREF _Toc181560492 \h </w:instrText>
+              <w:instrText xml:space="preserve"> PAGEREF _Toc181571785 \h </w:instrText>
             </w:r>
             <w:r>
               <w:rPr>
@@ -2229,7 +2141,7 @@
               <w:lang w:val="en-US"/>
             </w:rPr>
           </w:pPr>
-          <w:hyperlink w:anchor="_Toc181560493" w:history="1">
+          <w:hyperlink w:anchor="_Toc181571786" w:history="1">
             <w:r>
               <w:rPr>
                 <w:rStyle w:val="Hipervnculo"/>
@@ -2252,7 +2164,7 @@
               <w:rPr>
                 <w:webHidden/>
               </w:rPr>
-              <w:instrText xml:space="preserve"> PAGEREF _Toc181560493 \h </w:instrText>
+              <w:instrText xml:space="preserve"> PAGEREF _Toc181571786 \h </w:instrText>
             </w:r>
             <w:r>
               <w:rPr>
@@ -2289,7 +2201,7 @@
               <w:lang w:val="en-US"/>
             </w:rPr>
           </w:pPr>
-          <w:hyperlink w:anchor="_Toc181560494" w:history="1">
+          <w:hyperlink w:anchor="_Toc181571787" w:history="1">
             <w:r>
               <w:rPr>
                 <w:rStyle w:val="Hipervnculo"/>
@@ -2312,7 +2224,7 @@
               <w:rPr>
                 <w:webHidden/>
               </w:rPr>
-              <w:instrText xml:space="preserve"> PAGEREF _Toc181560494 \h </w:instrText>
+              <w:instrText xml:space="preserve"> PAGEREF _Toc181571787 \h </w:instrText>
             </w:r>
             <w:r>
               <w:rPr>
@@ -2352,7 +2264,7 @@
               <w:sz w:val="22"/>
             </w:rPr>
           </w:pPr>
-          <w:hyperlink w:anchor="_Toc181560495" w:history="1">
+          <w:hyperlink w:anchor="_Toc181571788" w:history="1">
             <w:r>
               <w:rPr>
                 <w:rStyle w:val="Hipervnculo"/>
@@ -2396,7 +2308,7 @@
                 <w:noProof/>
                 <w:webHidden/>
               </w:rPr>
-              <w:instrText xml:space="preserve"> PAGEREF _Toc181560495 \h </w:instrText>
+              <w:instrText xml:space="preserve"> PAGEREF _Toc181571788 \h </w:instrText>
             </w:r>
             <w:r>
               <w:rPr>
@@ -2440,7 +2352,7 @@
               <w:sz w:val="22"/>
             </w:rPr>
           </w:pPr>
-          <w:hyperlink w:anchor="_Toc181560496" w:history="1">
+          <w:hyperlink w:anchor="_Toc181571789" w:history="1">
             <w:r>
               <w:rPr>
                 <w:rStyle w:val="Hipervnculo"/>
@@ -2484,7 +2396,7 @@
                 <w:noProof/>
                 <w:webHidden/>
               </w:rPr>
-              <w:instrText xml:space="preserve"> PAGEREF _Toc181560496 \h </w:instrText>
+              <w:instrText xml:space="preserve"> PAGEREF _Toc181571789 \h </w:instrText>
             </w:r>
             <w:r>
               <w:rPr>
@@ -2528,7 +2440,7 @@
               <w:lang w:val="en-US"/>
             </w:rPr>
           </w:pPr>
-          <w:hyperlink w:anchor="_Toc181560497" w:history="1">
+          <w:hyperlink w:anchor="_Toc181571790" w:history="1">
             <w:r>
               <w:rPr>
                 <w:rStyle w:val="Hipervnculo"/>
@@ -2566,7 +2478,7 @@
               <w:rPr>
                 <w:webHidden/>
               </w:rPr>
-              <w:instrText xml:space="preserve"> PAGEREF _Toc181560497 \h </w:instrText>
+              <w:instrText xml:space="preserve"> PAGEREF _Toc181571790 \h </w:instrText>
             </w:r>
             <w:r>
               <w:rPr>
@@ -2606,7 +2518,7 @@
               <w:sz w:val="22"/>
             </w:rPr>
           </w:pPr>
-          <w:hyperlink w:anchor="_Toc181560498" w:history="1">
+          <w:hyperlink w:anchor="_Toc181571791" w:history="1">
             <w:r>
               <w:rPr>
                 <w:rStyle w:val="Hipervnculo"/>
@@ -2650,7 +2562,7 @@
                 <w:noProof/>
                 <w:webHidden/>
               </w:rPr>
-              <w:instrText xml:space="preserve"> PAGEREF _Toc181560498 \h </w:instrText>
+              <w:instrText xml:space="preserve"> PAGEREF _Toc181571791 \h </w:instrText>
             </w:r>
             <w:r>
               <w:rPr>
@@ -2693,7 +2605,7 @@
               <w:sz w:val="22"/>
             </w:rPr>
           </w:pPr>
-          <w:hyperlink w:anchor="_Toc181560499" w:history="1">
+          <w:hyperlink w:anchor="_Toc181571792" w:history="1">
             <w:r>
               <w:rPr>
                 <w:rStyle w:val="Hipervnculo"/>
@@ -2739,7 +2651,7 @@
                 <w:noProof/>
                 <w:webHidden/>
               </w:rPr>
-              <w:instrText xml:space="preserve"> PAGEREF _Toc181560499 \h </w:instrText>
+              <w:instrText xml:space="preserve"> PAGEREF _Toc181571792 \h </w:instrText>
             </w:r>
             <w:r>
               <w:rPr>
@@ -2782,7 +2694,7 @@
               <w:sz w:val="22"/>
             </w:rPr>
           </w:pPr>
-          <w:hyperlink w:anchor="_Toc181560500" w:history="1">
+          <w:hyperlink w:anchor="_Toc181571793" w:history="1">
             <w:r>
               <w:rPr>
                 <w:rStyle w:val="Hipervnculo"/>
@@ -2828,7 +2740,7 @@
                 <w:noProof/>
                 <w:webHidden/>
               </w:rPr>
-              <w:instrText xml:space="preserve"> PAGEREF _Toc181560500 \h </w:instrText>
+              <w:instrText xml:space="preserve"> PAGEREF _Toc181571793 \h </w:instrText>
             </w:r>
             <w:r>
               <w:rPr>
@@ -2871,7 +2783,7 @@
               <w:sz w:val="22"/>
             </w:rPr>
           </w:pPr>
-          <w:hyperlink w:anchor="_Toc181560501" w:history="1">
+          <w:hyperlink w:anchor="_Toc181571794" w:history="1">
             <w:r>
               <w:rPr>
                 <w:rStyle w:val="Hipervnculo"/>
@@ -2887,7 +2799,23 @@
                   <w:noProof/>
                   <w:lang w:val="es-ES"/>
                 </w:rPr>
-                <m:t>fq</m:t>
+                <m:t>f</m:t>
+              </m:r>
+              <m:r>
+                <w:rPr>
+                  <w:rStyle w:val="Hipervnculo"/>
+                  <w:noProof/>
+                  <w:lang w:val="es-ES"/>
+                </w:rPr>
+                <m:t>(</m:t>
+              </m:r>
+              <m:r>
+                <w:rPr>
+                  <w:rStyle w:val="Hipervnculo"/>
+                  <w:noProof/>
+                  <w:lang w:val="es-ES"/>
+                </w:rPr>
+                <m:t>q</m:t>
               </m:r>
               <m:r>
                 <m:rPr>
@@ -2936,7 +2864,31 @@
                   <w:noProof/>
                   <w:lang w:val="es-ES"/>
                 </w:rPr>
-                <m:t>4=0</m:t>
+                <m:t>4</m:t>
+              </m:r>
+              <m:r>
+                <m:rPr>
+                  <m:sty m:val="p"/>
+                </m:rPr>
+                <w:rPr>
+                  <w:rStyle w:val="Hipervnculo"/>
+                  <w:noProof/>
+                  <w:lang w:val="es-ES"/>
+                </w:rPr>
+                <m:t>)</m:t>
+              </m:r>
+              <w:bookmarkStart w:id="0" w:name="_GoBack"/>
+              <w:bookmarkEnd w:id="0"/>
+              <m:r>
+                <m:rPr>
+                  <m:sty m:val="p"/>
+                </m:rPr>
+                <w:rPr>
+                  <w:rStyle w:val="Hipervnculo"/>
+                  <w:noProof/>
+                  <w:lang w:val="es-ES"/>
+                </w:rPr>
+                <m:t>=0</m:t>
               </m:r>
             </m:oMath>
             <w:r>
@@ -2958,7 +2910,7 @@
                 <w:noProof/>
                 <w:webHidden/>
               </w:rPr>
-              <w:instrText xml:space="preserve"> PAGEREF _Toc181560501 \h </w:instrText>
+              <w:instrText xml:space="preserve"> PAGEREF _Toc181571794 \h </w:instrText>
             </w:r>
             <w:r>
               <w:rPr>
@@ -3001,7 +2953,7 @@
               <w:sz w:val="22"/>
             </w:rPr>
           </w:pPr>
-          <w:hyperlink w:anchor="_Toc181560502" w:history="1">
+          <w:hyperlink w:anchor="_Toc181571795" w:history="1">
             <w:r>
               <w:rPr>
                 <w:rStyle w:val="Hipervnculo"/>
@@ -3039,7 +2991,7 @@
                 <w:noProof/>
                 <w:webHidden/>
               </w:rPr>
-              <w:instrText xml:space="preserve"> PAGEREF _Toc181560502 \h </w:instrText>
+              <w:instrText xml:space="preserve"> PAGEREF _Toc181571795 \h </w:instrText>
             </w:r>
             <w:r>
               <w:rPr>
@@ -3083,7 +3035,7 @@
               <w:lang w:val="en-US"/>
             </w:rPr>
           </w:pPr>
-          <w:hyperlink w:anchor="_Toc181560503" w:history="1">
+          <w:hyperlink w:anchor="_Toc181571796" w:history="1">
             <w:r>
               <w:rPr>
                 <w:rStyle w:val="Hipervnculo"/>
@@ -3121,7 +3073,7 @@
               <w:rPr>
                 <w:webHidden/>
               </w:rPr>
-              <w:instrText xml:space="preserve"> PAGEREF _Toc181560503 \h </w:instrText>
+              <w:instrText xml:space="preserve"> PAGEREF _Toc181571796 \h </w:instrText>
             </w:r>
             <w:r>
               <w:rPr>
@@ -3161,7 +3113,7 @@
               <w:sz w:val="22"/>
             </w:rPr>
           </w:pPr>
-          <w:hyperlink w:anchor="_Toc181560504" w:history="1">
+          <w:hyperlink w:anchor="_Toc181571797" w:history="1">
             <w:r>
               <w:rPr>
                 <w:rStyle w:val="Hipervnculo"/>
@@ -3205,7 +3157,7 @@
                 <w:noProof/>
                 <w:webHidden/>
               </w:rPr>
-              <w:instrText xml:space="preserve"> PAGEREF _Toc181560504 \h </w:instrText>
+              <w:instrText xml:space="preserve"> PAGEREF _Toc181571797 \h </w:instrText>
             </w:r>
             <w:r>
               <w:rPr>
@@ -3249,7 +3201,7 @@
               <w:sz w:val="22"/>
             </w:rPr>
           </w:pPr>
-          <w:hyperlink w:anchor="_Toc181560505" w:history="1">
+          <w:hyperlink w:anchor="_Toc181571798" w:history="1">
             <w:r>
               <w:rPr>
                 <w:rStyle w:val="Hipervnculo"/>
@@ -3293,7 +3245,7 @@
                 <w:noProof/>
                 <w:webHidden/>
               </w:rPr>
-              <w:instrText xml:space="preserve"> PAGEREF _Toc181560505 \h </w:instrText>
+              <w:instrText xml:space="preserve"> PAGEREF _Toc181571798 \h </w:instrText>
             </w:r>
             <w:r>
               <w:rPr>
@@ -3334,7 +3286,7 @@
               <w:lang w:val="en-US"/>
             </w:rPr>
           </w:pPr>
-          <w:hyperlink w:anchor="_Toc181560506" w:history="1">
+          <w:hyperlink w:anchor="_Toc181571799" w:history="1">
             <w:r>
               <w:rPr>
                 <w:rStyle w:val="Hipervnculo"/>
@@ -3357,7 +3309,7 @@
               <w:rPr>
                 <w:webHidden/>
               </w:rPr>
-              <w:instrText xml:space="preserve"> PAGEREF _Toc181560506 \h </w:instrText>
+              <w:instrText xml:space="preserve"> PAGEREF _Toc181571799 \h </w:instrText>
             </w:r>
             <w:r>
               <w:rPr>
@@ -3394,7 +3346,7 @@
               <w:lang w:val="en-US"/>
             </w:rPr>
           </w:pPr>
-          <w:hyperlink w:anchor="_Toc181560507" w:history="1">
+          <w:hyperlink w:anchor="_Toc181571800" w:history="1">
             <w:r>
               <w:rPr>
                 <w:rStyle w:val="Hipervnculo"/>
@@ -3417,7 +3369,7 @@
               <w:rPr>
                 <w:webHidden/>
               </w:rPr>
-              <w:instrText xml:space="preserve"> PAGEREF _Toc181560507 \h </w:instrText>
+              <w:instrText xml:space="preserve"> PAGEREF _Toc181571800 \h </w:instrText>
             </w:r>
             <w:r>
               <w:rPr>
@@ -3454,7 +3406,7 @@
               <w:lang w:val="en-US"/>
             </w:rPr>
           </w:pPr>
-          <w:hyperlink w:anchor="_Toc181560508" w:history="1">
+          <w:hyperlink w:anchor="_Toc181571801" w:history="1">
             <w:r>
               <w:rPr>
                 <w:rStyle w:val="Hipervnculo"/>
@@ -3477,7 +3429,7 @@
               <w:rPr>
                 <w:webHidden/>
               </w:rPr>
-              <w:instrText xml:space="preserve"> PAGEREF _Toc181560508 \h </w:instrText>
+              <w:instrText xml:space="preserve"> PAGEREF _Toc181571801 \h </w:instrText>
             </w:r>
             <w:r>
               <w:rPr>
@@ -3516,7 +3468,7 @@
               <w:sz w:val="22"/>
             </w:rPr>
           </w:pPr>
-          <w:hyperlink w:anchor="_Toc181560509" w:history="1">
+          <w:hyperlink w:anchor="_Toc181571802" w:history="1">
             <w:r>
               <w:rPr>
                 <w:rStyle w:val="Hipervnculo"/>
@@ -3544,7 +3496,7 @@
                 <w:noProof/>
                 <w:webHidden/>
               </w:rPr>
-              <w:instrText xml:space="preserve"> PAGEREF _Toc181560509 \h </w:instrText>
+              <w:instrText xml:space="preserve"> PAGEREF _Toc181571802 \h </w:instrText>
             </w:r>
             <w:r>
               <w:rPr>
@@ -3587,7 +3539,7 @@
               <w:sz w:val="22"/>
             </w:rPr>
           </w:pPr>
-          <w:hyperlink w:anchor="_Toc181560510" w:history="1">
+          <w:hyperlink w:anchor="_Toc181571803" w:history="1">
             <w:r>
               <w:rPr>
                 <w:rStyle w:val="Hipervnculo"/>
@@ -3615,7 +3567,7 @@
                 <w:noProof/>
                 <w:webHidden/>
               </w:rPr>
-              <w:instrText xml:space="preserve"> PAGEREF _Toc181560510 \h </w:instrText>
+              <w:instrText xml:space="preserve"> PAGEREF _Toc181571803 \h </w:instrText>
             </w:r>
             <w:r>
               <w:rPr>
@@ -3658,7 +3610,7 @@
               <w:sz w:val="22"/>
             </w:rPr>
           </w:pPr>
-          <w:hyperlink w:anchor="_Toc181560511" w:history="1">
+          <w:hyperlink w:anchor="_Toc181571804" w:history="1">
             <w:r>
               <w:rPr>
                 <w:rStyle w:val="Hipervnculo"/>
@@ -3686,7 +3638,7 @@
                 <w:noProof/>
                 <w:webHidden/>
               </w:rPr>
-              <w:instrText xml:space="preserve"> PAGEREF _Toc181560511 \h </w:instrText>
+              <w:instrText xml:space="preserve"> PAGEREF _Toc181571804 \h </w:instrText>
             </w:r>
             <w:r>
               <w:rPr>
@@ -3729,7 +3681,7 @@
               <w:sz w:val="22"/>
             </w:rPr>
           </w:pPr>
-          <w:hyperlink w:anchor="_Toc181560512" w:history="1">
+          <w:hyperlink w:anchor="_Toc181571805" w:history="1">
             <w:r>
               <w:rPr>
                 <w:rStyle w:val="Hipervnculo"/>
@@ -3757,7 +3709,7 @@
                 <w:noProof/>
                 <w:webHidden/>
               </w:rPr>
-              <w:instrText xml:space="preserve"> PAGEREF _Toc181560512 \h </w:instrText>
+              <w:instrText xml:space="preserve"> PAGEREF _Toc181571805 \h </w:instrText>
             </w:r>
             <w:r>
               <w:rPr>
@@ -3800,7 +3752,7 @@
               <w:sz w:val="22"/>
             </w:rPr>
           </w:pPr>
-          <w:hyperlink w:anchor="_Toc181560513" w:history="1">
+          <w:hyperlink w:anchor="_Toc181571806" w:history="1">
             <w:r>
               <w:rPr>
                 <w:rStyle w:val="Hipervnculo"/>
@@ -3828,7 +3780,7 @@
                 <w:noProof/>
                 <w:webHidden/>
               </w:rPr>
-              <w:instrText xml:space="preserve"> PAGEREF _Toc181560513 \h </w:instrText>
+              <w:instrText xml:space="preserve"> PAGEREF _Toc181571806 \h </w:instrText>
             </w:r>
             <w:r>
               <w:rPr>
@@ -3871,7 +3823,7 @@
               <w:sz w:val="22"/>
             </w:rPr>
           </w:pPr>
-          <w:hyperlink w:anchor="_Toc181560514" w:history="1">
+          <w:hyperlink w:anchor="_Toc181571807" w:history="1">
             <w:r>
               <w:rPr>
                 <w:rStyle w:val="Hipervnculo"/>
@@ -3899,7 +3851,7 @@
                 <w:noProof/>
                 <w:webHidden/>
               </w:rPr>
-              <w:instrText xml:space="preserve"> PAGEREF _Toc181560514 \h </w:instrText>
+              <w:instrText xml:space="preserve"> PAGEREF _Toc181571807 \h </w:instrText>
             </w:r>
             <w:r>
               <w:rPr>
@@ -3942,7 +3894,7 @@
               <w:sz w:val="22"/>
             </w:rPr>
           </w:pPr>
-          <w:hyperlink w:anchor="_Toc181560515" w:history="1">
+          <w:hyperlink w:anchor="_Toc181571808" w:history="1">
             <w:r>
               <w:rPr>
                 <w:rStyle w:val="Hipervnculo"/>
@@ -3970,7 +3922,7 @@
                 <w:noProof/>
                 <w:webHidden/>
               </w:rPr>
-              <w:instrText xml:space="preserve"> PAGEREF _Toc181560515 \h </w:instrText>
+              <w:instrText xml:space="preserve"> PAGEREF _Toc181571808 \h </w:instrText>
             </w:r>
             <w:r>
               <w:rPr>
@@ -4013,11 +3965,12 @@
               <w:sz w:val="22"/>
             </w:rPr>
           </w:pPr>
-          <w:hyperlink w:anchor="_Toc181560516" w:history="1">
+          <w:hyperlink w:anchor="_Toc181571809" w:history="1">
             <w:r>
               <w:rPr>
                 <w:rStyle w:val="Hipervnculo"/>
                 <w:noProof/>
+                <w:lang w:val="es-AR"/>
               </w:rPr>
               <w:t>Anexo 8 – Trayectorias.</w:t>
             </w:r>
@@ -4040,7 +3993,7 @@
                 <w:noProof/>
                 <w:webHidden/>
               </w:rPr>
-              <w:instrText xml:space="preserve"> PAGEREF _Toc181560516 \h </w:instrText>
+              <w:instrText xml:space="preserve"> PAGEREF _Toc181571809 \h </w:instrText>
             </w:r>
             <w:r>
               <w:rPr>
@@ -4136,7 +4089,7 @@
           <w:lang w:val="es-ES"/>
         </w:rPr>
       </w:pPr>
-      <w:bookmarkStart w:id="0" w:name="_Toc181560474"/>
+      <w:bookmarkStart w:id="1" w:name="_Toc181571768"/>
       <w:r>
         <w:rPr>
           <w:lang w:val="es-ES"/>
@@ -4156,7 +4109,7 @@
         </w:rPr>
         <w:t>Resumen</w:t>
       </w:r>
-      <w:bookmarkEnd w:id="0"/>
+      <w:bookmarkEnd w:id="1"/>
     </w:p>
     <w:p>
       <w:pPr>
@@ -4335,14 +4288,14 @@
         </w:rPr>
         <w:tab/>
       </w:r>
-      <w:bookmarkStart w:id="1" w:name="_Toc181560475"/>
+      <w:bookmarkStart w:id="2" w:name="_Toc181571769"/>
       <w:r>
         <w:rPr>
           <w:lang w:val="en-GB"/>
         </w:rPr>
         <w:t>Abstract</w:t>
       </w:r>
-      <w:bookmarkEnd w:id="1"/>
+      <w:bookmarkEnd w:id="2"/>
     </w:p>
     <w:p>
       <w:pPr>
@@ -4476,7 +4429,7 @@
           <w:lang w:val="es-ES"/>
         </w:rPr>
       </w:pPr>
-      <w:bookmarkStart w:id="2" w:name="_Toc181560476"/>
+      <w:bookmarkStart w:id="3" w:name="_Toc181571770"/>
       <w:r>
         <w:rPr>
           <w:lang w:val="es-ES"/>
@@ -4496,7 +4449,7 @@
         </w:rPr>
         <w:t>Introducción</w:t>
       </w:r>
-      <w:bookmarkEnd w:id="2"/>
+      <w:bookmarkEnd w:id="3"/>
     </w:p>
     <w:p>
       <w:pPr>
@@ -4579,7 +4532,7 @@
           <w:lang w:val="es-ES"/>
         </w:rPr>
       </w:pPr>
-      <w:bookmarkStart w:id="3" w:name="_Toc181560477"/>
+      <w:bookmarkStart w:id="4" w:name="_Toc181571771"/>
       <w:r>
         <w:rPr>
           <w:lang w:val="es-ES"/>
@@ -4593,7 +4546,7 @@
         <w:tab/>
         <w:t>Descripción de la Aplicación</w:t>
       </w:r>
-      <w:bookmarkEnd w:id="3"/>
+      <w:bookmarkEnd w:id="4"/>
     </w:p>
     <w:p>
       <w:pPr>
@@ -4628,7 +4581,7 @@
           <w:lang w:val="es-ES"/>
         </w:rPr>
       </w:pPr>
-      <w:bookmarkStart w:id="4" w:name="_Toc181560478"/>
+      <w:bookmarkStart w:id="5" w:name="_Toc181571772"/>
       <w:r>
         <w:rPr>
           <w:lang w:val="es-ES"/>
@@ -4673,7 +4626,7 @@
         </w:rPr>
         <w:t xml:space="preserve"> de la celda</w:t>
       </w:r>
-      <w:bookmarkEnd w:id="4"/>
+      <w:bookmarkEnd w:id="5"/>
     </w:p>
     <w:p>
       <w:pPr>
@@ -4767,7 +4720,7 @@
           <w:noProof/>
         </w:rPr>
         <w:drawing>
-          <wp:inline distT="0" distB="0" distL="0" distR="0" wp14:anchorId="36629E32" wp14:editId="005BC653">
+          <wp:inline distT="0" distB="0" distL="0" distR="0" wp14:anchorId="503E2C02" wp14:editId="7C2B3405">
             <wp:extent cx="4529469" cy="2936642"/>
             <wp:effectExtent l="19050" t="19050" r="23495" b="16510"/>
             <wp:docPr id="21" name="Imagen 21"/>
@@ -4908,7 +4861,7 @@
           <w:lang w:val="es-ES"/>
         </w:rPr>
       </w:pPr>
-      <w:bookmarkStart w:id="5" w:name="_Toc181560479"/>
+      <w:bookmarkStart w:id="6" w:name="_Toc181571773"/>
       <w:r>
         <w:rPr>
           <w:u w:val="none"/>
@@ -4931,7 +4884,7 @@
         </w:rPr>
         <w:t>Máquina de gammagrafía</w:t>
       </w:r>
-      <w:bookmarkEnd w:id="5"/>
+      <w:bookmarkEnd w:id="6"/>
     </w:p>
     <w:p>
       <w:pPr>
@@ -5108,7 +5061,7 @@
           <w:noProof/>
         </w:rPr>
         <w:drawing>
-          <wp:inline distT="0" distB="0" distL="0" distR="0" wp14:anchorId="5BD41B25" wp14:editId="73222EBC">
+          <wp:inline distT="0" distB="0" distL="0" distR="0" wp14:anchorId="2077A838" wp14:editId="297D1E53">
             <wp:extent cx="2881423" cy="1772075"/>
             <wp:effectExtent l="19050" t="19050" r="14605" b="19050"/>
             <wp:docPr id="23" name="Imagen 23"/>
@@ -5165,7 +5118,7 @@
           <w:noProof/>
         </w:rPr>
         <w:drawing>
-          <wp:inline distT="0" distB="0" distL="0" distR="0" wp14:anchorId="0167D7CA" wp14:editId="07CE0CAB">
+          <wp:inline distT="0" distB="0" distL="0" distR="0" wp14:anchorId="40010F8C" wp14:editId="03BE4CF3">
             <wp:extent cx="2604109" cy="1771650"/>
             <wp:effectExtent l="19050" t="19050" r="25400" b="19050"/>
             <wp:docPr id="24" name="Imagen 24"/>
@@ -5288,7 +5241,7 @@
           <w:lang w:val="es-ES"/>
         </w:rPr>
       </w:pPr>
-      <w:bookmarkStart w:id="6" w:name="_Toc181560480"/>
+      <w:bookmarkStart w:id="7" w:name="_Toc181571774"/>
       <w:r>
         <w:rPr>
           <w:u w:val="none"/>
@@ -5316,7 +5269,7 @@
         </w:rPr>
         <w:t>Pastillas de material radiactivo</w:t>
       </w:r>
-      <w:bookmarkEnd w:id="6"/>
+      <w:bookmarkEnd w:id="7"/>
     </w:p>
     <w:p>
       <w:pPr>
@@ -5355,7 +5308,7 @@
           <w:noProof/>
         </w:rPr>
         <w:drawing>
-          <wp:inline distT="0" distB="0" distL="0" distR="0" wp14:anchorId="06C8BD04" wp14:editId="5E07E69B">
+          <wp:inline distT="0" distB="0" distL="0" distR="0" wp14:anchorId="369AA6A6" wp14:editId="65F7F3C3">
             <wp:extent cx="2612572" cy="1500839"/>
             <wp:effectExtent l="19050" t="19050" r="16510" b="23495"/>
             <wp:docPr id="25" name="Imagen 25"/>
@@ -5447,7 +5400,7 @@
           <w:lang w:val="es-ES"/>
         </w:rPr>
       </w:pPr>
-      <w:bookmarkStart w:id="7" w:name="_Toc181560481"/>
+      <w:bookmarkStart w:id="8" w:name="_Toc181571775"/>
       <w:r>
         <w:rPr>
           <w:u w:val="none"/>
@@ -5489,7 +5442,7 @@
         </w:rPr>
         <w:t>Contenedor</w:t>
       </w:r>
-      <w:bookmarkEnd w:id="7"/>
+      <w:bookmarkEnd w:id="8"/>
     </w:p>
     <w:p>
       <w:pPr>
@@ -5670,7 +5623,7 @@
         </w:rPr>
         <w:lastRenderedPageBreak/>
         <w:drawing>
-          <wp:inline distT="0" distB="0" distL="0" distR="0" wp14:anchorId="7026A794" wp14:editId="15F7C411">
+          <wp:inline distT="0" distB="0" distL="0" distR="0" wp14:anchorId="744F6849" wp14:editId="2560C0AB">
             <wp:extent cx="2706004" cy="1589314"/>
             <wp:effectExtent l="19050" t="19050" r="18415" b="11430"/>
             <wp:docPr id="26" name="Imagen 26"/>
@@ -5727,7 +5680,7 @@
           <w:noProof/>
         </w:rPr>
         <w:drawing>
-          <wp:inline distT="0" distB="0" distL="0" distR="0" wp14:anchorId="5D2977D9" wp14:editId="1AE7981A">
+          <wp:inline distT="0" distB="0" distL="0" distR="0" wp14:anchorId="0BCC1540" wp14:editId="2F57E369">
             <wp:extent cx="2791847" cy="1578428"/>
             <wp:effectExtent l="19050" t="19050" r="27940" b="22225"/>
             <wp:docPr id="27" name="Imagen 27"/>
@@ -5853,7 +5806,7 @@
           <w:lang w:val="es-ES"/>
         </w:rPr>
       </w:pPr>
-      <w:bookmarkStart w:id="8" w:name="_Toc181560482"/>
+      <w:bookmarkStart w:id="9" w:name="_Toc181571776"/>
       <w:r>
         <w:rPr>
           <w:u w:val="none"/>
@@ -5874,7 +5827,7 @@
         </w:rPr>
         <w:t>Mesa</w:t>
       </w:r>
-      <w:bookmarkEnd w:id="8"/>
+      <w:bookmarkEnd w:id="9"/>
     </w:p>
     <w:p>
       <w:pPr>
@@ -5955,7 +5908,7 @@
           <w:noProof/>
         </w:rPr>
         <w:drawing>
-          <wp:inline distT="0" distB="0" distL="0" distR="0" wp14:anchorId="41C2CFDF" wp14:editId="69AD8137">
+          <wp:inline distT="0" distB="0" distL="0" distR="0" wp14:anchorId="59BBFE99" wp14:editId="1C230A0D">
             <wp:extent cx="2296886" cy="2136878"/>
             <wp:effectExtent l="19050" t="19050" r="27305" b="15875"/>
             <wp:docPr id="28" name="Imagen 28"/>
@@ -6038,7 +5991,7 @@
           <w:lang w:val="es-ES"/>
         </w:rPr>
       </w:pPr>
-      <w:bookmarkStart w:id="9" w:name="_Toc181560483"/>
+      <w:bookmarkStart w:id="10" w:name="_Toc181571777"/>
       <w:r>
         <w:rPr>
           <w:lang w:val="es-ES"/>
@@ -6057,7 +6010,7 @@
         </w:rPr>
         <w:t>Secuencia de operaciones</w:t>
       </w:r>
-      <w:bookmarkEnd w:id="9"/>
+      <w:bookmarkEnd w:id="10"/>
     </w:p>
     <w:p>
       <w:pPr>
@@ -6181,7 +6134,7 @@
           <w:lang w:val="es-ES"/>
         </w:rPr>
       </w:pPr>
-      <w:bookmarkStart w:id="10" w:name="_Toc181560484"/>
+      <w:bookmarkStart w:id="11" w:name="_Toc181571778"/>
       <w:r>
         <w:rPr>
           <w:lang w:val="es-ES"/>
@@ -6200,7 +6153,7 @@
         </w:rPr>
         <w:t>Características del robot</w:t>
       </w:r>
-      <w:bookmarkEnd w:id="10"/>
+      <w:bookmarkEnd w:id="11"/>
     </w:p>
     <w:p>
       <w:pPr>
@@ -6349,7 +6302,7 @@
           <w:noProof/>
         </w:rPr>
         <w:drawing>
-          <wp:inline distT="0" distB="0" distL="0" distR="0" wp14:anchorId="404307B4" wp14:editId="668B4D5E">
+          <wp:inline distT="0" distB="0" distL="0" distR="0" wp14:anchorId="07455FBB" wp14:editId="0B763598">
             <wp:extent cx="2133600" cy="2083299"/>
             <wp:effectExtent l="19050" t="19050" r="19050" b="12700"/>
             <wp:docPr id="29" name="Imagen 29"/>
@@ -6406,7 +6359,7 @@
           <w:noProof/>
         </w:rPr>
         <w:drawing>
-          <wp:inline distT="0" distB="0" distL="0" distR="0" wp14:anchorId="09240C35" wp14:editId="46F506CC">
+          <wp:inline distT="0" distB="0" distL="0" distR="0" wp14:anchorId="50F2C596" wp14:editId="0C92DC45">
             <wp:extent cx="3231290" cy="2071254"/>
             <wp:effectExtent l="19050" t="19050" r="26670" b="24765"/>
             <wp:docPr id="30" name="Imagen 30"/>
@@ -6602,7 +6555,6 @@
           <w:lang w:val="es-ES"/>
         </w:rPr>
       </w:pPr>
-      <w:bookmarkStart w:id="11" w:name="_Toc181560485"/>
       <w:r>
         <w:rPr>
           <w:lang w:val="es-ES"/>
@@ -6621,7 +6573,6 @@
         </w:rPr>
         <w:t>Efector final</w:t>
       </w:r>
-      <w:bookmarkEnd w:id="11"/>
     </w:p>
     <w:p>
       <w:pPr>
@@ -6811,7 +6762,7 @@
           <w:noProof/>
         </w:rPr>
         <w:drawing>
-          <wp:inline distT="0" distB="0" distL="0" distR="0" wp14:anchorId="4112AD21" wp14:editId="0488AFD9">
+          <wp:inline distT="0" distB="0" distL="0" distR="0" wp14:anchorId="7918EF32" wp14:editId="4C9D50D7">
             <wp:extent cx="2998381" cy="1920722"/>
             <wp:effectExtent l="19050" t="19050" r="12065" b="22860"/>
             <wp:docPr id="31" name="Imagen 31"/>
@@ -6907,7 +6858,7 @@
           <w:lang w:val="es-AR"/>
         </w:rPr>
       </w:pPr>
-      <w:bookmarkStart w:id="12" w:name="_Toc181560486"/>
+      <w:bookmarkStart w:id="12" w:name="_Toc181571779"/>
       <w:r>
         <w:rPr>
           <w:u w:val="none"/>
@@ -6999,7 +6950,7 @@
           <w:noProof/>
         </w:rPr>
         <w:drawing>
-          <wp:inline distT="0" distB="0" distL="0" distR="0" wp14:anchorId="0ACEB7AE" wp14:editId="37694941">
+          <wp:inline distT="0" distB="0" distL="0" distR="0" wp14:anchorId="4A3335BA" wp14:editId="29A0F072">
             <wp:extent cx="4986669" cy="2580839"/>
             <wp:effectExtent l="19050" t="19050" r="23495" b="10160"/>
             <wp:docPr id="32" name="Imagen 32"/>
@@ -7116,7 +7067,7 @@
           <w:noProof/>
         </w:rPr>
         <w:drawing>
-          <wp:inline distT="0" distB="0" distL="0" distR="0" wp14:anchorId="5D2C218C" wp14:editId="010FD706">
+          <wp:inline distT="0" distB="0" distL="0" distR="0" wp14:anchorId="1E351105" wp14:editId="74DAAADB">
             <wp:extent cx="4029739" cy="3357017"/>
             <wp:effectExtent l="19050" t="19050" r="27940" b="15240"/>
             <wp:docPr id="33" name="Imagen 33"/>
@@ -7200,7 +7151,7 @@
           <w:lang w:val="es-ES"/>
         </w:rPr>
       </w:pPr>
-      <w:bookmarkStart w:id="13" w:name="_Toc181560487"/>
+      <w:bookmarkStart w:id="13" w:name="_Toc181571780"/>
       <w:r>
         <w:rPr>
           <w:rFonts w:eastAsiaTheme="minorEastAsia"/>
@@ -7504,7 +7455,7 @@
           <w:lang w:val="es-ES"/>
         </w:rPr>
       </w:pPr>
-      <w:bookmarkStart w:id="14" w:name="_Toc181560488"/>
+      <w:bookmarkStart w:id="14" w:name="_Toc181571781"/>
       <w:r>
         <w:rPr>
           <w:lang w:val="es-ES"/>
@@ -7567,7 +7518,7 @@
           <w:lang w:val="es-ES"/>
         </w:rPr>
       </w:pPr>
-      <w:bookmarkStart w:id="15" w:name="_Toc181560489"/>
+      <w:bookmarkStart w:id="15" w:name="_Toc181571782"/>
       <w:r>
         <w:rPr>
           <w:lang w:val="es-ES"/>
@@ -7739,7 +7690,7 @@
           <w:noProof/>
         </w:rPr>
         <w:drawing>
-          <wp:inline distT="0" distB="0" distL="0" distR="0" wp14:anchorId="57B8A884" wp14:editId="6225B7A7">
+          <wp:inline distT="0" distB="0" distL="0" distR="0" wp14:anchorId="03D97CB0" wp14:editId="4991196B">
             <wp:extent cx="4538134" cy="4538134"/>
             <wp:effectExtent l="19050" t="19050" r="15240" b="15240"/>
             <wp:docPr id="34" name="Imagen 34"/>
@@ -7833,7 +7784,6 @@
         </w:rPr>
         <w:t>Denavit-Hartenberg</w:t>
       </w:r>
-      <w:bookmarkStart w:id="16" w:name="_Toc181560490"/>
       <w:proofErr w:type="spellEnd"/>
       <w:r>
         <w:rPr>
@@ -7849,6 +7799,7 @@
           <w:lang w:val="es-ES"/>
         </w:rPr>
       </w:pPr>
+      <w:bookmarkStart w:id="16" w:name="_Toc181571783"/>
       <w:r>
         <w:rPr>
           <w:lang w:val="es-ES"/>
@@ -9265,7 +9216,7 @@
           <w:lang w:val="es-ES"/>
         </w:rPr>
       </w:pPr>
-      <w:bookmarkStart w:id="17" w:name="_Toc181560491"/>
+      <w:bookmarkStart w:id="17" w:name="_Toc181571784"/>
       <w:r>
         <w:rPr>
           <w:lang w:val="es-ES"/>
@@ -9548,7 +9499,7 @@
           <w:noProof/>
         </w:rPr>
         <w:drawing>
-          <wp:inline distT="0" distB="0" distL="0" distR="0" wp14:anchorId="5C0375F5" wp14:editId="0BD10E40">
+          <wp:inline distT="0" distB="0" distL="0" distR="0" wp14:anchorId="5E890186" wp14:editId="490C61D9">
             <wp:extent cx="3397028" cy="2438189"/>
             <wp:effectExtent l="19050" t="19050" r="13335" b="19685"/>
             <wp:docPr id="35" name="Imagen 35"/>
@@ -9846,7 +9797,7 @@
           <w:lang w:val="es-AR"/>
         </w:rPr>
       </w:pPr>
-      <w:bookmarkStart w:id="18" w:name="_Toc181560492"/>
+      <w:bookmarkStart w:id="18" w:name="_Toc181571785"/>
       <w:r>
         <w:rPr>
           <w:rFonts w:eastAsiaTheme="minorEastAsia"/>
@@ -10781,7 +10732,7 @@
           <w:lang w:val="es-ES"/>
         </w:rPr>
       </w:pPr>
-      <w:bookmarkStart w:id="19" w:name="_Toc181560493"/>
+      <w:bookmarkStart w:id="19" w:name="_Toc181571786"/>
       <w:r>
         <w:rPr>
           <w:lang w:val="es-ES"/>
@@ -11064,7 +11015,7 @@
           <w:lang w:val="es-ES"/>
         </w:rPr>
       </w:pPr>
-      <w:bookmarkStart w:id="20" w:name="_Toc181560494"/>
+      <w:bookmarkStart w:id="20" w:name="_Toc181571787"/>
       <w:r>
         <w:rPr>
           <w:lang w:val="es-ES"/>
@@ -11427,7 +11378,7 @@
           <w:lang w:val="es-ES"/>
         </w:rPr>
       </w:pPr>
-      <w:bookmarkStart w:id="21" w:name="_Toc181560495"/>
+      <w:bookmarkStart w:id="21" w:name="_Toc181571788"/>
       <w:r>
         <w:rPr>
           <w:rFonts w:eastAsiaTheme="minorEastAsia"/>
@@ -11476,7 +11427,7 @@
           <w:noProof/>
         </w:rPr>
         <w:drawing>
-          <wp:anchor distT="0" distB="0" distL="114300" distR="114300" simplePos="0" relativeHeight="251697152" behindDoc="0" locked="0" layoutInCell="1" allowOverlap="1" wp14:anchorId="6E1C6359" wp14:editId="521C2CB7">
+          <wp:anchor distT="0" distB="0" distL="114300" distR="114300" simplePos="0" relativeHeight="251697152" behindDoc="0" locked="0" layoutInCell="1" allowOverlap="1" wp14:anchorId="7B129872" wp14:editId="136F4CB8">
             <wp:simplePos x="0" y="0"/>
             <wp:positionH relativeFrom="margin">
               <wp:align>center</wp:align>
@@ -11724,7 +11675,7 @@
           <w:noProof/>
         </w:rPr>
         <w:drawing>
-          <wp:anchor distT="0" distB="0" distL="114300" distR="114300" simplePos="0" relativeHeight="251696128" behindDoc="0" locked="0" layoutInCell="1" allowOverlap="1" wp14:anchorId="1DEC4B2A" wp14:editId="0D0C4634">
+          <wp:anchor distT="0" distB="0" distL="114300" distR="114300" simplePos="0" relativeHeight="251696128" behindDoc="0" locked="0" layoutInCell="1" allowOverlap="1" wp14:anchorId="2FDEF9B3" wp14:editId="181E0D1D">
             <wp:simplePos x="0" y="0"/>
             <wp:positionH relativeFrom="margin">
               <wp:align>center</wp:align>
@@ -11835,7 +11786,7 @@
           <w:noProof/>
         </w:rPr>
         <w:drawing>
-          <wp:anchor distT="0" distB="0" distL="114300" distR="114300" simplePos="0" relativeHeight="251699200" behindDoc="0" locked="0" layoutInCell="1" allowOverlap="1" wp14:anchorId="438F122B" wp14:editId="62B8D29C">
+          <wp:anchor distT="0" distB="0" distL="114300" distR="114300" simplePos="0" relativeHeight="251699200" behindDoc="0" locked="0" layoutInCell="1" allowOverlap="1" wp14:anchorId="53E9D725" wp14:editId="4CEF7677">
             <wp:simplePos x="0" y="0"/>
             <wp:positionH relativeFrom="margin">
               <wp:posOffset>617220</wp:posOffset>
@@ -11931,7 +11882,7 @@
           <w:noProof/>
         </w:rPr>
         <w:drawing>
-          <wp:anchor distT="0" distB="0" distL="114300" distR="114300" simplePos="0" relativeHeight="251698176" behindDoc="0" locked="0" layoutInCell="1" allowOverlap="1" wp14:anchorId="61FA4325" wp14:editId="58EED59B">
+          <wp:anchor distT="0" distB="0" distL="114300" distR="114300" simplePos="0" relativeHeight="251698176" behindDoc="0" locked="0" layoutInCell="1" allowOverlap="1" wp14:anchorId="19A08CC6" wp14:editId="3F453DBB">
             <wp:simplePos x="0" y="0"/>
             <wp:positionH relativeFrom="page">
               <wp:posOffset>829310</wp:posOffset>
@@ -12275,7 +12226,7 @@
           <w:noProof/>
         </w:rPr>
         <w:drawing>
-          <wp:anchor distT="0" distB="0" distL="114300" distR="114300" simplePos="0" relativeHeight="251700224" behindDoc="0" locked="0" layoutInCell="1" allowOverlap="1" wp14:anchorId="15F2B47B" wp14:editId="1B02A110">
+          <wp:anchor distT="0" distB="0" distL="114300" distR="114300" simplePos="0" relativeHeight="251700224" behindDoc="0" locked="0" layoutInCell="1" allowOverlap="1" wp14:anchorId="5E5DF271" wp14:editId="552ACC24">
             <wp:simplePos x="0" y="0"/>
             <wp:positionH relativeFrom="margin">
               <wp:align>center</wp:align>
@@ -12351,7 +12302,7 @@
         </w:rPr>
         <w:lastRenderedPageBreak/>
         <w:drawing>
-          <wp:anchor distT="0" distB="0" distL="114300" distR="114300" simplePos="0" relativeHeight="251680768" behindDoc="0" locked="0" layoutInCell="1" allowOverlap="1" wp14:anchorId="4EE99623" wp14:editId="7231A6D0">
+          <wp:anchor distT="0" distB="0" distL="114300" distR="114300" simplePos="0" relativeHeight="251680768" behindDoc="0" locked="0" layoutInCell="1" allowOverlap="1" wp14:anchorId="65E65AEA" wp14:editId="513ABB0B">
             <wp:simplePos x="0" y="0"/>
             <wp:positionH relativeFrom="margin">
               <wp:align>center</wp:align>
@@ -12446,7 +12397,7 @@
           <w:noProof/>
         </w:rPr>
         <w:drawing>
-          <wp:anchor distT="0" distB="0" distL="114300" distR="114300" simplePos="0" relativeHeight="251681792" behindDoc="0" locked="0" layoutInCell="1" allowOverlap="1" wp14:anchorId="75D95B31" wp14:editId="2E8C5AB7">
+          <wp:anchor distT="0" distB="0" distL="114300" distR="114300" simplePos="0" relativeHeight="251681792" behindDoc="0" locked="0" layoutInCell="1" allowOverlap="1" wp14:anchorId="55266E62" wp14:editId="3E659A31">
             <wp:simplePos x="0" y="0"/>
             <wp:positionH relativeFrom="margin">
               <wp:align>center</wp:align>
@@ -12603,7 +12554,7 @@
           <w:noProof/>
         </w:rPr>
         <w:drawing>
-          <wp:anchor distT="0" distB="0" distL="114300" distR="114300" simplePos="0" relativeHeight="251682816" behindDoc="0" locked="0" layoutInCell="1" allowOverlap="1" wp14:anchorId="5980F851" wp14:editId="43C33376">
+          <wp:anchor distT="0" distB="0" distL="114300" distR="114300" simplePos="0" relativeHeight="251682816" behindDoc="0" locked="0" layoutInCell="1" allowOverlap="1" wp14:anchorId="5AD9158D" wp14:editId="551CB490">
             <wp:simplePos x="0" y="0"/>
             <wp:positionH relativeFrom="margin">
               <wp:align>center</wp:align>
@@ -12714,7 +12665,7 @@
           <w:noProof/>
         </w:rPr>
         <w:drawing>
-          <wp:anchor distT="0" distB="0" distL="114300" distR="114300" simplePos="0" relativeHeight="251683840" behindDoc="0" locked="0" layoutInCell="1" allowOverlap="1" wp14:anchorId="016EFE39" wp14:editId="1A1B86F5">
+          <wp:anchor distT="0" distB="0" distL="114300" distR="114300" simplePos="0" relativeHeight="251683840" behindDoc="0" locked="0" layoutInCell="1" allowOverlap="1" wp14:anchorId="4947D932" wp14:editId="646427AE">
             <wp:simplePos x="0" y="0"/>
             <wp:positionH relativeFrom="margin">
               <wp:align>center</wp:align>
@@ -12890,7 +12841,7 @@
           <w:noProof/>
         </w:rPr>
         <w:drawing>
-          <wp:anchor distT="0" distB="0" distL="114300" distR="114300" simplePos="0" relativeHeight="251701248" behindDoc="0" locked="0" layoutInCell="1" allowOverlap="1" wp14:anchorId="061605B9" wp14:editId="15E64EB2">
+          <wp:anchor distT="0" distB="0" distL="114300" distR="114300" simplePos="0" relativeHeight="251701248" behindDoc="0" locked="0" layoutInCell="1" allowOverlap="1" wp14:anchorId="71533A37" wp14:editId="20ED416D">
             <wp:simplePos x="0" y="0"/>
             <wp:positionH relativeFrom="margin">
               <wp:align>center</wp:align>
@@ -12979,7 +12930,7 @@
           <w:noProof/>
         </w:rPr>
         <w:drawing>
-          <wp:anchor distT="0" distB="0" distL="114300" distR="114300" simplePos="0" relativeHeight="251684864" behindDoc="0" locked="0" layoutInCell="1" allowOverlap="1" wp14:anchorId="0DC7E868" wp14:editId="492B99E0">
+          <wp:anchor distT="0" distB="0" distL="114300" distR="114300" simplePos="0" relativeHeight="251684864" behindDoc="0" locked="0" layoutInCell="1" allowOverlap="1" wp14:anchorId="48F3A65F" wp14:editId="4642780F">
             <wp:simplePos x="0" y="0"/>
             <wp:positionH relativeFrom="margin">
               <wp:posOffset>1763395</wp:posOffset>
@@ -13240,7 +13191,7 @@
           <w:noProof/>
         </w:rPr>
         <w:drawing>
-          <wp:anchor distT="0" distB="0" distL="114300" distR="114300" simplePos="0" relativeHeight="251707392" behindDoc="0" locked="0" layoutInCell="1" allowOverlap="1" wp14:anchorId="28BAF3C7" wp14:editId="2726E51F">
+          <wp:anchor distT="0" distB="0" distL="114300" distR="114300" simplePos="0" relativeHeight="251707392" behindDoc="0" locked="0" layoutInCell="1" allowOverlap="1" wp14:anchorId="7F04A05A" wp14:editId="6F8892C8">
             <wp:simplePos x="0" y="0"/>
             <wp:positionH relativeFrom="margin">
               <wp:align>center</wp:align>
@@ -13486,7 +13437,7 @@
           <w:noProof/>
         </w:rPr>
         <w:drawing>
-          <wp:anchor distT="0" distB="0" distL="114300" distR="114300" simplePos="0" relativeHeight="251685888" behindDoc="0" locked="0" layoutInCell="1" allowOverlap="1" wp14:anchorId="1A30A936" wp14:editId="57D83304">
+          <wp:anchor distT="0" distB="0" distL="114300" distR="114300" simplePos="0" relativeHeight="251685888" behindDoc="0" locked="0" layoutInCell="1" allowOverlap="1" wp14:anchorId="6573E6AF" wp14:editId="2A65B44C">
             <wp:simplePos x="0" y="0"/>
             <wp:positionH relativeFrom="page">
               <wp:posOffset>3114040</wp:posOffset>
@@ -13747,7 +13698,7 @@
           <w:noProof/>
         </w:rPr>
         <w:drawing>
-          <wp:anchor distT="0" distB="0" distL="114300" distR="114300" simplePos="0" relativeHeight="251686912" behindDoc="0" locked="0" layoutInCell="1" allowOverlap="1" wp14:anchorId="6CB3263D" wp14:editId="2FCEF510">
+          <wp:anchor distT="0" distB="0" distL="114300" distR="114300" simplePos="0" relativeHeight="251686912" behindDoc="0" locked="0" layoutInCell="1" allowOverlap="1" wp14:anchorId="1AC29098" wp14:editId="3531C78C">
             <wp:simplePos x="0" y="0"/>
             <wp:positionH relativeFrom="margin">
               <wp:posOffset>1853354</wp:posOffset>
@@ -13879,7 +13830,7 @@
           <w:noProof/>
         </w:rPr>
         <w:drawing>
-          <wp:anchor distT="0" distB="0" distL="114300" distR="114300" simplePos="0" relativeHeight="251702272" behindDoc="0" locked="0" layoutInCell="1" allowOverlap="1" wp14:anchorId="376123FA" wp14:editId="24AE09AF">
+          <wp:anchor distT="0" distB="0" distL="114300" distR="114300" simplePos="0" relativeHeight="251702272" behindDoc="0" locked="0" layoutInCell="1" allowOverlap="1" wp14:anchorId="51C125C4" wp14:editId="79D2BD38">
             <wp:simplePos x="0" y="0"/>
             <wp:positionH relativeFrom="margin">
               <wp:align>center</wp:align>
@@ -13974,7 +13925,7 @@
           <w:noProof/>
         </w:rPr>
         <w:drawing>
-          <wp:anchor distT="0" distB="0" distL="114300" distR="114300" simplePos="0" relativeHeight="251703296" behindDoc="0" locked="0" layoutInCell="1" allowOverlap="1" wp14:anchorId="43B64C93" wp14:editId="43A4809D">
+          <wp:anchor distT="0" distB="0" distL="114300" distR="114300" simplePos="0" relativeHeight="251703296" behindDoc="0" locked="0" layoutInCell="1" allowOverlap="1" wp14:anchorId="24B21890" wp14:editId="5F6512AB">
             <wp:simplePos x="0" y="0"/>
             <wp:positionH relativeFrom="margin">
               <wp:align>center</wp:align>
@@ -14116,7 +14067,7 @@
           <w:noProof/>
         </w:rPr>
         <w:drawing>
-          <wp:anchor distT="0" distB="0" distL="114300" distR="114300" simplePos="0" relativeHeight="251704320" behindDoc="0" locked="0" layoutInCell="1" allowOverlap="1" wp14:anchorId="18E6DF61" wp14:editId="6C1445A2">
+          <wp:anchor distT="0" distB="0" distL="114300" distR="114300" simplePos="0" relativeHeight="251704320" behindDoc="0" locked="0" layoutInCell="1" allowOverlap="1" wp14:anchorId="438A1977" wp14:editId="23FFC0ED">
             <wp:simplePos x="0" y="0"/>
             <wp:positionH relativeFrom="margin">
               <wp:align>center</wp:align>
@@ -14222,7 +14173,7 @@
           <w:noProof/>
         </w:rPr>
         <w:drawing>
-          <wp:anchor distT="0" distB="0" distL="114300" distR="114300" simplePos="0" relativeHeight="251705344" behindDoc="0" locked="0" layoutInCell="1" allowOverlap="1" wp14:anchorId="60C036EF" wp14:editId="49085BFF">
+          <wp:anchor distT="0" distB="0" distL="114300" distR="114300" simplePos="0" relativeHeight="251705344" behindDoc="0" locked="0" layoutInCell="1" allowOverlap="1" wp14:anchorId="2598FDA5" wp14:editId="79476998">
             <wp:simplePos x="0" y="0"/>
             <wp:positionH relativeFrom="margin">
               <wp:align>center</wp:align>
@@ -14357,7 +14308,7 @@
           <w:noProof/>
         </w:rPr>
         <w:drawing>
-          <wp:anchor distT="0" distB="0" distL="114300" distR="114300" simplePos="0" relativeHeight="251706368" behindDoc="0" locked="0" layoutInCell="1" allowOverlap="1" wp14:anchorId="60BE1210" wp14:editId="76C7D423">
+          <wp:anchor distT="0" distB="0" distL="114300" distR="114300" simplePos="0" relativeHeight="251706368" behindDoc="0" locked="0" layoutInCell="1" allowOverlap="1" wp14:anchorId="43AAF770" wp14:editId="10E34A0C">
             <wp:simplePos x="0" y="0"/>
             <wp:positionH relativeFrom="margin">
               <wp:align>center</wp:align>
@@ -14525,7 +14476,7 @@
           <w:noProof/>
         </w:rPr>
         <w:drawing>
-          <wp:anchor distT="0" distB="0" distL="114300" distR="114300" simplePos="0" relativeHeight="251687936" behindDoc="0" locked="0" layoutInCell="1" allowOverlap="1" wp14:anchorId="6B224B3B" wp14:editId="1DAD14D7">
+          <wp:anchor distT="0" distB="0" distL="114300" distR="114300" simplePos="0" relativeHeight="251687936" behindDoc="0" locked="0" layoutInCell="1" allowOverlap="1" wp14:anchorId="7A9C7756" wp14:editId="5F9B1B4C">
             <wp:simplePos x="0" y="0"/>
             <wp:positionH relativeFrom="margin">
               <wp:align>center</wp:align>
@@ -14625,7 +14576,7 @@
           <w:noProof/>
         </w:rPr>
         <w:drawing>
-          <wp:anchor distT="0" distB="0" distL="114300" distR="114300" simplePos="0" relativeHeight="251688960" behindDoc="0" locked="0" layoutInCell="1" allowOverlap="1" wp14:anchorId="14054012" wp14:editId="28779C5A">
+          <wp:anchor distT="0" distB="0" distL="114300" distR="114300" simplePos="0" relativeHeight="251688960" behindDoc="0" locked="0" layoutInCell="1" allowOverlap="1" wp14:anchorId="5C731297" wp14:editId="459D1ED8">
             <wp:simplePos x="0" y="0"/>
             <wp:positionH relativeFrom="margin">
               <wp:align>center</wp:align>
@@ -14842,7 +14793,7 @@
           <w:noProof/>
         </w:rPr>
         <w:drawing>
-          <wp:anchor distT="0" distB="0" distL="114300" distR="114300" simplePos="0" relativeHeight="251689984" behindDoc="0" locked="0" layoutInCell="1" allowOverlap="1" wp14:anchorId="0FB5E9D0" wp14:editId="50D77E1E">
+          <wp:anchor distT="0" distB="0" distL="114300" distR="114300" simplePos="0" relativeHeight="251689984" behindDoc="0" locked="0" layoutInCell="1" allowOverlap="1" wp14:anchorId="37B52534" wp14:editId="3B610279">
             <wp:simplePos x="0" y="0"/>
             <wp:positionH relativeFrom="margin">
               <wp:posOffset>1614805</wp:posOffset>
@@ -15013,7 +14964,7 @@
           <w:noProof/>
         </w:rPr>
         <w:drawing>
-          <wp:anchor distT="0" distB="0" distL="114300" distR="114300" simplePos="0" relativeHeight="251691008" behindDoc="0" locked="0" layoutInCell="1" allowOverlap="1" wp14:anchorId="760E2F85" wp14:editId="1941ED5E">
+          <wp:anchor distT="0" distB="0" distL="114300" distR="114300" simplePos="0" relativeHeight="251691008" behindDoc="0" locked="0" layoutInCell="1" allowOverlap="1" wp14:anchorId="13A8B9D8" wp14:editId="4AEE5DCC">
             <wp:simplePos x="0" y="0"/>
             <wp:positionH relativeFrom="margin">
               <wp:align>center</wp:align>
@@ -15250,7 +15201,7 @@
           <w:noProof/>
         </w:rPr>
         <w:drawing>
-          <wp:anchor distT="0" distB="0" distL="114300" distR="114300" simplePos="0" relativeHeight="251692032" behindDoc="0" locked="0" layoutInCell="1" allowOverlap="1" wp14:anchorId="113BDFEE" wp14:editId="410A6A74">
+          <wp:anchor distT="0" distB="0" distL="114300" distR="114300" simplePos="0" relativeHeight="251692032" behindDoc="0" locked="0" layoutInCell="1" allowOverlap="1" wp14:anchorId="35913C24" wp14:editId="1FBD1389">
             <wp:simplePos x="0" y="0"/>
             <wp:positionH relativeFrom="margin">
               <wp:align>center</wp:align>
@@ -15341,7 +15292,7 @@
           <w:noProof/>
         </w:rPr>
         <w:drawing>
-          <wp:anchor distT="0" distB="0" distL="114300" distR="114300" simplePos="0" relativeHeight="251693056" behindDoc="0" locked="0" layoutInCell="1" allowOverlap="1" wp14:anchorId="47A2B86F" wp14:editId="488A616D">
+          <wp:anchor distT="0" distB="0" distL="114300" distR="114300" simplePos="0" relativeHeight="251693056" behindDoc="0" locked="0" layoutInCell="1" allowOverlap="1" wp14:anchorId="33A33C2C" wp14:editId="18482FD1">
             <wp:simplePos x="0" y="0"/>
             <wp:positionH relativeFrom="margin">
               <wp:align>center</wp:align>
@@ -15449,7 +15400,7 @@
           <w:noProof/>
         </w:rPr>
         <w:drawing>
-          <wp:anchor distT="0" distB="0" distL="114300" distR="114300" simplePos="0" relativeHeight="251710464" behindDoc="0" locked="0" layoutInCell="1" allowOverlap="1" wp14:anchorId="7FC86A09" wp14:editId="4698DA7F">
+          <wp:anchor distT="0" distB="0" distL="114300" distR="114300" simplePos="0" relativeHeight="251710464" behindDoc="0" locked="0" layoutInCell="1" allowOverlap="1" wp14:anchorId="245F1183" wp14:editId="6E2F84FC">
             <wp:simplePos x="0" y="0"/>
             <wp:positionH relativeFrom="margin">
               <wp:posOffset>81491</wp:posOffset>
@@ -15791,7 +15742,7 @@
           <w:noProof/>
         </w:rPr>
         <w:drawing>
-          <wp:anchor distT="0" distB="0" distL="114300" distR="114300" simplePos="0" relativeHeight="251708416" behindDoc="0" locked="0" layoutInCell="1" allowOverlap="1" wp14:anchorId="71032475" wp14:editId="209A930B">
+          <wp:anchor distT="0" distB="0" distL="114300" distR="114300" simplePos="0" relativeHeight="251708416" behindDoc="0" locked="0" layoutInCell="1" allowOverlap="1" wp14:anchorId="300DB2CE" wp14:editId="18915B09">
             <wp:simplePos x="0" y="0"/>
             <wp:positionH relativeFrom="margin">
               <wp:align>center</wp:align>
@@ -15881,7 +15832,7 @@
           <w:noProof/>
         </w:rPr>
         <w:drawing>
-          <wp:anchor distT="0" distB="0" distL="114300" distR="114300" simplePos="0" relativeHeight="251709440" behindDoc="0" locked="0" layoutInCell="1" allowOverlap="1" wp14:anchorId="6507CE42" wp14:editId="77809BD4">
+          <wp:anchor distT="0" distB="0" distL="114300" distR="114300" simplePos="0" relativeHeight="251709440" behindDoc="0" locked="0" layoutInCell="1" allowOverlap="1" wp14:anchorId="1B5E25B7" wp14:editId="05D98EDD">
             <wp:simplePos x="0" y="0"/>
             <wp:positionH relativeFrom="margin">
               <wp:align>center</wp:align>
@@ -15953,7 +15904,7 @@
           <w:noProof/>
         </w:rPr>
         <w:drawing>
-          <wp:anchor distT="0" distB="0" distL="114300" distR="114300" simplePos="0" relativeHeight="251694080" behindDoc="0" locked="0" layoutInCell="1" allowOverlap="1" wp14:anchorId="1BE71CC3" wp14:editId="0C472B5A">
+          <wp:anchor distT="0" distB="0" distL="114300" distR="114300" simplePos="0" relativeHeight="251694080" behindDoc="0" locked="0" layoutInCell="1" allowOverlap="1" wp14:anchorId="064A5C4D" wp14:editId="6DC3A94C">
             <wp:simplePos x="0" y="0"/>
             <wp:positionH relativeFrom="margin">
               <wp:align>center</wp:align>
@@ -16050,7 +16001,7 @@
           <w:noProof/>
         </w:rPr>
         <w:drawing>
-          <wp:anchor distT="0" distB="0" distL="114300" distR="114300" simplePos="0" relativeHeight="251695104" behindDoc="0" locked="0" layoutInCell="1" allowOverlap="1" wp14:anchorId="2156CC40" wp14:editId="19E681B4">
+          <wp:anchor distT="0" distB="0" distL="114300" distR="114300" simplePos="0" relativeHeight="251695104" behindDoc="0" locked="0" layoutInCell="1" allowOverlap="1" wp14:anchorId="0642B2B6" wp14:editId="47CEAB63">
             <wp:simplePos x="0" y="0"/>
             <wp:positionH relativeFrom="margin">
               <wp:align>center</wp:align>
@@ -16145,7 +16096,7 @@
           <w:lang w:val="es-ES"/>
         </w:rPr>
       </w:pPr>
-      <w:bookmarkStart w:id="22" w:name="_Toc181560496"/>
+      <w:bookmarkStart w:id="22" w:name="_Toc181571789"/>
       <w:r>
         <w:rPr>
           <w:lang w:val="es-ES"/>
@@ -17524,7 +17475,7 @@
           <w:lang w:val="es-ES"/>
         </w:rPr>
       </w:pPr>
-      <w:bookmarkStart w:id="23" w:name="_Toc181560497"/>
+      <w:bookmarkStart w:id="23" w:name="_Toc181571790"/>
       <w:r>
         <w:rPr>
           <w:lang w:val="es-ES"/>
@@ -18343,7 +18294,7 @@
           <w:lang w:val="es-ES"/>
         </w:rPr>
       </w:pPr>
-      <w:bookmarkStart w:id="24" w:name="_Toc181560498"/>
+      <w:bookmarkStart w:id="24" w:name="_Toc181571791"/>
       <w:r>
         <w:rPr>
           <w:rFonts w:eastAsiaTheme="minorEastAsia"/>
@@ -19416,7 +19367,7 @@
           <w:lang w:val="es-ES"/>
         </w:rPr>
       </w:pPr>
-      <w:bookmarkStart w:id="25" w:name="_Toc181560499"/>
+      <w:bookmarkStart w:id="25" w:name="_Toc181571792"/>
       <w:r>
         <w:rPr>
           <w:rFonts w:eastAsiaTheme="minorEastAsia"/>
@@ -19619,7 +19570,7 @@
           <w:noProof/>
         </w:rPr>
         <w:drawing>
-          <wp:inline distT="0" distB="0" distL="0" distR="0" wp14:anchorId="3B0A90AF" wp14:editId="1F5D6F8E">
+          <wp:inline distT="0" distB="0" distL="0" distR="0" wp14:anchorId="5E91C270" wp14:editId="18DD3BD9">
             <wp:extent cx="5060592" cy="2456121"/>
             <wp:effectExtent l="19050" t="19050" r="26035" b="20955"/>
             <wp:docPr id="20" name="Imagen 20"/>
@@ -19703,7 +19654,7 @@
           <w:lang w:val="es-ES"/>
         </w:rPr>
       </w:pPr>
-      <w:bookmarkStart w:id="26" w:name="_Toc181560500"/>
+      <w:bookmarkStart w:id="26" w:name="_Toc181571793"/>
       <w:r>
         <w:rPr>
           <w:rFonts w:eastAsiaTheme="minorEastAsia"/>
@@ -21370,7 +21321,7 @@
           <w:noProof/>
         </w:rPr>
         <w:drawing>
-          <wp:inline distT="0" distB="0" distL="0" distR="0" wp14:anchorId="5E8D563A" wp14:editId="6F31DF63">
+          <wp:inline distT="0" distB="0" distL="0" distR="0" wp14:anchorId="7A4DC2A7" wp14:editId="1431842C">
             <wp:extent cx="5167423" cy="2641316"/>
             <wp:effectExtent l="19050" t="19050" r="14605" b="26035"/>
             <wp:docPr id="22" name="Imagen 22"/>
@@ -21453,7 +21404,7 @@
           <w:lang w:val="es-ES"/>
         </w:rPr>
       </w:pPr>
-      <w:bookmarkStart w:id="27" w:name="_Toc181560501"/>
+      <w:bookmarkStart w:id="27" w:name="_Toc181571794"/>
       <w:r>
         <w:rPr>
           <w:lang w:val="es-ES"/>
@@ -21923,7 +21874,7 @@
           <w:noProof/>
         </w:rPr>
         <w:drawing>
-          <wp:anchor distT="0" distB="0" distL="114300" distR="114300" simplePos="0" relativeHeight="251665408" behindDoc="0" locked="0" layoutInCell="1" allowOverlap="1" wp14:anchorId="6753BD84" wp14:editId="129A682B">
+          <wp:anchor distT="0" distB="0" distL="114300" distR="114300" simplePos="0" relativeHeight="251665408" behindDoc="0" locked="0" layoutInCell="1" allowOverlap="1" wp14:anchorId="4AA83711" wp14:editId="32557206">
             <wp:simplePos x="0" y="0"/>
             <wp:positionH relativeFrom="column">
               <wp:posOffset>1437005</wp:posOffset>
@@ -21993,7 +21944,7 @@
           <w:noProof/>
         </w:rPr>
         <w:drawing>
-          <wp:anchor distT="0" distB="0" distL="114300" distR="114300" simplePos="0" relativeHeight="251666432" behindDoc="0" locked="0" layoutInCell="1" allowOverlap="1" wp14:anchorId="489AECB9" wp14:editId="7A784A66">
+          <wp:anchor distT="0" distB="0" distL="114300" distR="114300" simplePos="0" relativeHeight="251666432" behindDoc="0" locked="0" layoutInCell="1" allowOverlap="1" wp14:anchorId="13042AC5" wp14:editId="21E99232">
             <wp:simplePos x="0" y="0"/>
             <wp:positionH relativeFrom="column">
               <wp:posOffset>1390104</wp:posOffset>
@@ -22471,7 +22422,7 @@
         </w:rPr>
         <w:lastRenderedPageBreak/>
         <w:drawing>
-          <wp:anchor distT="0" distB="0" distL="114300" distR="114300" simplePos="0" relativeHeight="251667456" behindDoc="0" locked="0" layoutInCell="1" allowOverlap="1" wp14:anchorId="73CB190C" wp14:editId="518CD413">
+          <wp:anchor distT="0" distB="0" distL="114300" distR="114300" simplePos="0" relativeHeight="251667456" behindDoc="0" locked="0" layoutInCell="1" allowOverlap="1" wp14:anchorId="189A5EB5" wp14:editId="753017B9">
             <wp:simplePos x="0" y="0"/>
             <wp:positionH relativeFrom="column">
               <wp:posOffset>1385437</wp:posOffset>
@@ -22543,7 +22494,7 @@
           <w:noProof/>
         </w:rPr>
         <w:drawing>
-          <wp:anchor distT="0" distB="0" distL="114300" distR="114300" simplePos="0" relativeHeight="251668480" behindDoc="0" locked="0" layoutInCell="1" allowOverlap="1" wp14:anchorId="22B0BA57" wp14:editId="70E9627C">
+          <wp:anchor distT="0" distB="0" distL="114300" distR="114300" simplePos="0" relativeHeight="251668480" behindDoc="0" locked="0" layoutInCell="1" allowOverlap="1" wp14:anchorId="510B0978" wp14:editId="2F7724C6">
             <wp:simplePos x="0" y="0"/>
             <wp:positionH relativeFrom="column">
               <wp:posOffset>1435262</wp:posOffset>
@@ -23596,7 +23547,7 @@
           <w:noProof/>
         </w:rPr>
         <w:drawing>
-          <wp:inline distT="0" distB="0" distL="0" distR="0" wp14:anchorId="447428CE" wp14:editId="374E471F">
+          <wp:inline distT="0" distB="0" distL="0" distR="0" wp14:anchorId="08CA9427" wp14:editId="5EA255F0">
             <wp:extent cx="3891517" cy="3328271"/>
             <wp:effectExtent l="19050" t="19050" r="13970" b="24765"/>
             <wp:docPr id="36" name="Imagen 36"/>
@@ -23850,7 +23801,7 @@
           <w:lang w:val="es-ES"/>
         </w:rPr>
       </w:pPr>
-      <w:bookmarkStart w:id="28" w:name="_Toc181560502"/>
+      <w:bookmarkStart w:id="28" w:name="_Toc181571795"/>
       <w:r>
         <w:rPr>
           <w:rFonts w:eastAsiaTheme="minorEastAsia"/>
@@ -24014,7 +23965,7 @@
         </w:rPr>
         <w:lastRenderedPageBreak/>
         <w:drawing>
-          <wp:anchor distT="0" distB="0" distL="114300" distR="114300" simplePos="0" relativeHeight="251669504" behindDoc="0" locked="0" layoutInCell="1" allowOverlap="1" wp14:anchorId="510B3366" wp14:editId="35BFA04E">
+          <wp:anchor distT="0" distB="0" distL="114300" distR="114300" simplePos="0" relativeHeight="251669504" behindDoc="0" locked="0" layoutInCell="1" allowOverlap="1" wp14:anchorId="14C7B3C1" wp14:editId="4C47A53D">
             <wp:simplePos x="0" y="0"/>
             <wp:positionH relativeFrom="column">
               <wp:posOffset>1842135</wp:posOffset>
@@ -24121,7 +24072,7 @@
           <w:noProof/>
         </w:rPr>
         <w:drawing>
-          <wp:anchor distT="0" distB="0" distL="114300" distR="114300" simplePos="0" relativeHeight="251670528" behindDoc="0" locked="0" layoutInCell="1" allowOverlap="1" wp14:anchorId="1375986C" wp14:editId="216510AC">
+          <wp:anchor distT="0" distB="0" distL="114300" distR="114300" simplePos="0" relativeHeight="251670528" behindDoc="0" locked="0" layoutInCell="1" allowOverlap="1" wp14:anchorId="739B02DA" wp14:editId="1CC96267">
             <wp:simplePos x="0" y="0"/>
             <wp:positionH relativeFrom="column">
               <wp:posOffset>1842135</wp:posOffset>
@@ -24239,7 +24190,7 @@
           <w:noProof/>
         </w:rPr>
         <w:drawing>
-          <wp:anchor distT="0" distB="0" distL="114300" distR="114300" simplePos="0" relativeHeight="251671552" behindDoc="0" locked="0" layoutInCell="1" allowOverlap="1" wp14:anchorId="3D3D5B1F" wp14:editId="75DD766C">
+          <wp:anchor distT="0" distB="0" distL="114300" distR="114300" simplePos="0" relativeHeight="251671552" behindDoc="0" locked="0" layoutInCell="1" allowOverlap="1" wp14:anchorId="74D0D0F9" wp14:editId="09EDCC35">
             <wp:simplePos x="0" y="0"/>
             <wp:positionH relativeFrom="column">
               <wp:posOffset>1534352</wp:posOffset>
@@ -24322,7 +24273,7 @@
           <w:noProof/>
         </w:rPr>
         <w:drawing>
-          <wp:anchor distT="0" distB="0" distL="114300" distR="114300" simplePos="0" relativeHeight="251663360" behindDoc="0" locked="0" layoutInCell="1" allowOverlap="1" wp14:anchorId="4C14F5FC" wp14:editId="5B2D9BFD">
+          <wp:anchor distT="0" distB="0" distL="114300" distR="114300" simplePos="0" relativeHeight="251663360" behindDoc="0" locked="0" layoutInCell="1" allowOverlap="1" wp14:anchorId="02BFC887" wp14:editId="127C8A29">
             <wp:simplePos x="0" y="0"/>
             <wp:positionH relativeFrom="margin">
               <wp:posOffset>2213079</wp:posOffset>
@@ -24480,7 +24431,7 @@
           <w:noProof/>
         </w:rPr>
         <w:drawing>
-          <wp:anchor distT="0" distB="0" distL="114300" distR="114300" simplePos="0" relativeHeight="251664384" behindDoc="0" locked="0" layoutInCell="1" allowOverlap="1" wp14:anchorId="7FC611C6" wp14:editId="6CA4C31A">
+          <wp:anchor distT="0" distB="0" distL="114300" distR="114300" simplePos="0" relativeHeight="251664384" behindDoc="0" locked="0" layoutInCell="1" allowOverlap="1" wp14:anchorId="4ECCF354" wp14:editId="279FC358">
             <wp:simplePos x="0" y="0"/>
             <wp:positionH relativeFrom="column">
               <wp:posOffset>2220018</wp:posOffset>
@@ -24565,7 +24516,7 @@
           <w:noProof/>
         </w:rPr>
         <w:drawing>
-          <wp:anchor distT="0" distB="0" distL="114300" distR="114300" simplePos="0" relativeHeight="251672576" behindDoc="0" locked="0" layoutInCell="1" allowOverlap="1" wp14:anchorId="07DDA520" wp14:editId="5D1466A9">
+          <wp:anchor distT="0" distB="0" distL="114300" distR="114300" simplePos="0" relativeHeight="251672576" behindDoc="0" locked="0" layoutInCell="1" allowOverlap="1" wp14:anchorId="3715DB0A" wp14:editId="5C80E0D4">
             <wp:simplePos x="0" y="0"/>
             <wp:positionH relativeFrom="column">
               <wp:posOffset>1391303</wp:posOffset>
@@ -24680,7 +24631,7 @@
           <w:noProof/>
         </w:rPr>
         <w:drawing>
-          <wp:anchor distT="0" distB="0" distL="114300" distR="114300" simplePos="0" relativeHeight="251673600" behindDoc="0" locked="0" layoutInCell="1" allowOverlap="1" wp14:anchorId="72B33769" wp14:editId="6061A510">
+          <wp:anchor distT="0" distB="0" distL="114300" distR="114300" simplePos="0" relativeHeight="251673600" behindDoc="0" locked="0" layoutInCell="1" allowOverlap="1" wp14:anchorId="573E08D2" wp14:editId="01E53809">
             <wp:simplePos x="0" y="0"/>
             <wp:positionH relativeFrom="column">
               <wp:posOffset>1711422</wp:posOffset>
@@ -24777,7 +24728,7 @@
           <w:noProof/>
         </w:rPr>
         <w:drawing>
-          <wp:anchor distT="0" distB="0" distL="114300" distR="114300" simplePos="0" relativeHeight="251674624" behindDoc="0" locked="0" layoutInCell="1" allowOverlap="1" wp14:anchorId="1D0642A3" wp14:editId="1437294E">
+          <wp:anchor distT="0" distB="0" distL="114300" distR="114300" simplePos="0" relativeHeight="251674624" behindDoc="0" locked="0" layoutInCell="1" allowOverlap="1" wp14:anchorId="51A35948" wp14:editId="02A4F8DA">
             <wp:simplePos x="0" y="0"/>
             <wp:positionH relativeFrom="column">
               <wp:posOffset>1249488</wp:posOffset>
@@ -24978,7 +24929,7 @@
           <w:noProof/>
         </w:rPr>
         <w:drawing>
-          <wp:anchor distT="0" distB="0" distL="114300" distR="114300" simplePos="0" relativeHeight="251675648" behindDoc="0" locked="0" layoutInCell="1" allowOverlap="1" wp14:anchorId="233850C2" wp14:editId="427ED787">
+          <wp:anchor distT="0" distB="0" distL="114300" distR="114300" simplePos="0" relativeHeight="251675648" behindDoc="0" locked="0" layoutInCell="1" allowOverlap="1" wp14:anchorId="0DEB7793" wp14:editId="1D56F49C">
             <wp:simplePos x="0" y="0"/>
             <wp:positionH relativeFrom="column">
               <wp:posOffset>1183005</wp:posOffset>
@@ -25232,7 +25183,7 @@
           <w:noProof/>
         </w:rPr>
         <w:drawing>
-          <wp:anchor distT="0" distB="0" distL="114300" distR="114300" simplePos="0" relativeHeight="251676672" behindDoc="0" locked="0" layoutInCell="1" allowOverlap="1" wp14:anchorId="171F2099" wp14:editId="20325D28">
+          <wp:anchor distT="0" distB="0" distL="114300" distR="114300" simplePos="0" relativeHeight="251676672" behindDoc="0" locked="0" layoutInCell="1" allowOverlap="1" wp14:anchorId="2BF2C39D" wp14:editId="1B4727B1">
             <wp:simplePos x="0" y="0"/>
             <wp:positionH relativeFrom="column">
               <wp:posOffset>1183521</wp:posOffset>
@@ -25336,7 +25287,7 @@
           <w:noProof/>
         </w:rPr>
         <w:drawing>
-          <wp:anchor distT="0" distB="0" distL="114300" distR="114300" simplePos="0" relativeHeight="251677696" behindDoc="0" locked="0" layoutInCell="1" allowOverlap="1" wp14:anchorId="472C9DA0" wp14:editId="15A7D1A7">
+          <wp:anchor distT="0" distB="0" distL="114300" distR="114300" simplePos="0" relativeHeight="251677696" behindDoc="0" locked="0" layoutInCell="1" allowOverlap="1" wp14:anchorId="13CA79FC" wp14:editId="59B6735D">
             <wp:simplePos x="0" y="0"/>
             <wp:positionH relativeFrom="column">
               <wp:posOffset>1183551</wp:posOffset>
@@ -25403,7 +25354,7 @@
           <w:noProof/>
         </w:rPr>
         <w:drawing>
-          <wp:anchor distT="0" distB="0" distL="114300" distR="114300" simplePos="0" relativeHeight="251678720" behindDoc="0" locked="0" layoutInCell="1" allowOverlap="1" wp14:anchorId="6222B4EE" wp14:editId="6883F051">
+          <wp:anchor distT="0" distB="0" distL="114300" distR="114300" simplePos="0" relativeHeight="251678720" behindDoc="0" locked="0" layoutInCell="1" allowOverlap="1" wp14:anchorId="4774A72D" wp14:editId="613E54DE">
             <wp:simplePos x="0" y="0"/>
             <wp:positionH relativeFrom="column">
               <wp:posOffset>1182739</wp:posOffset>
@@ -26607,7 +26558,7 @@
           <w:noProof/>
         </w:rPr>
         <w:drawing>
-          <wp:inline distT="0" distB="0" distL="0" distR="0" wp14:anchorId="28A735CF" wp14:editId="31C80CA2">
+          <wp:inline distT="0" distB="0" distL="0" distR="0" wp14:anchorId="2F4ABB97" wp14:editId="610B5BC2">
             <wp:extent cx="3746777" cy="1783722"/>
             <wp:effectExtent l="19050" t="19050" r="25400" b="26035"/>
             <wp:docPr id="37" name="Imagen 37"/>
@@ -26667,7 +26618,7 @@
           <w:noProof/>
         </w:rPr>
         <w:drawing>
-          <wp:inline distT="0" distB="0" distL="0" distR="0" wp14:anchorId="2F41902A" wp14:editId="0144655E">
+          <wp:inline distT="0" distB="0" distL="0" distR="0" wp14:anchorId="0BCBFB65" wp14:editId="2B7803F8">
             <wp:extent cx="2098325" cy="1794619"/>
             <wp:effectExtent l="19050" t="19050" r="16510" b="15240"/>
             <wp:docPr id="38" name="Imagen 38"/>
@@ -27033,7 +26984,7 @@
           <w:lang w:val="es-ES"/>
         </w:rPr>
       </w:pPr>
-      <w:bookmarkStart w:id="29" w:name="_Toc181560503"/>
+      <w:bookmarkStart w:id="29" w:name="_Toc181571796"/>
       <w:r>
         <w:rPr>
           <w:lang w:val="es-ES"/>
@@ -27061,7 +27012,7 @@
           <w:lang w:val="es-ES"/>
         </w:rPr>
       </w:pPr>
-      <w:bookmarkStart w:id="30" w:name="_Toc181560504"/>
+      <w:bookmarkStart w:id="30" w:name="_Toc181571797"/>
       <w:r>
         <w:rPr>
           <w:lang w:val="es-ES"/>
@@ -27109,7 +27060,7 @@
           <w:noProof/>
         </w:rPr>
         <w:drawing>
-          <wp:inline distT="0" distB="0" distL="0" distR="0" wp14:anchorId="32268748" wp14:editId="0B20984C">
+          <wp:inline distT="0" distB="0" distL="0" distR="0" wp14:anchorId="363D165D" wp14:editId="608FBC62">
             <wp:extent cx="1905000" cy="1533211"/>
             <wp:effectExtent l="19050" t="19050" r="19050" b="10160"/>
             <wp:docPr id="110" name="Imagen 110"/>
@@ -27174,7 +27125,7 @@
           <w:noProof/>
         </w:rPr>
         <w:drawing>
-          <wp:inline distT="0" distB="0" distL="0" distR="0" wp14:anchorId="7C7F457E" wp14:editId="3999E138">
+          <wp:inline distT="0" distB="0" distL="0" distR="0" wp14:anchorId="053AEA33" wp14:editId="40375DE6">
             <wp:extent cx="2431473" cy="1531379"/>
             <wp:effectExtent l="19050" t="19050" r="26035" b="12065"/>
             <wp:docPr id="109" name="Imagen 109"/>
@@ -27294,7 +27245,7 @@
         </w:rPr>
         <w:lastRenderedPageBreak/>
         <w:drawing>
-          <wp:inline distT="0" distB="0" distL="0" distR="0" wp14:anchorId="5F61F14A" wp14:editId="4B729CD1">
+          <wp:inline distT="0" distB="0" distL="0" distR="0" wp14:anchorId="271A2350" wp14:editId="30C976FA">
             <wp:extent cx="2112819" cy="1862185"/>
             <wp:effectExtent l="19050" t="19050" r="20955" b="24130"/>
             <wp:docPr id="108" name="Imagen 108"/>
@@ -27365,7 +27316,7 @@
           <w:noProof/>
         </w:rPr>
         <w:drawing>
-          <wp:inline distT="0" distB="0" distL="0" distR="0" wp14:anchorId="06F6DE36" wp14:editId="47B780C1">
+          <wp:inline distT="0" distB="0" distL="0" distR="0" wp14:anchorId="3BE6102A" wp14:editId="0406EFB5">
             <wp:extent cx="2156446" cy="1870364"/>
             <wp:effectExtent l="19050" t="19050" r="15875" b="15875"/>
             <wp:docPr id="107" name="Imagen 107"/>
@@ -27479,7 +27430,7 @@
           <w:noProof/>
         </w:rPr>
         <w:drawing>
-          <wp:inline distT="0" distB="0" distL="0" distR="0" wp14:anchorId="65D33C5C" wp14:editId="73BF83DD">
+          <wp:inline distT="0" distB="0" distL="0" distR="0" wp14:anchorId="19269B11" wp14:editId="7917AA5F">
             <wp:extent cx="2034540" cy="1969625"/>
             <wp:effectExtent l="19050" t="19050" r="22860" b="12065"/>
             <wp:docPr id="106" name="Imagen 106"/>
@@ -27550,7 +27501,7 @@
           <w:noProof/>
         </w:rPr>
         <w:drawing>
-          <wp:inline distT="0" distB="0" distL="0" distR="0" wp14:anchorId="1532AB73" wp14:editId="53E81F7C">
+          <wp:inline distT="0" distB="0" distL="0" distR="0" wp14:anchorId="1BEFFE7E" wp14:editId="6102E48A">
             <wp:extent cx="2040171" cy="1939637"/>
             <wp:effectExtent l="19050" t="19050" r="17780" b="22860"/>
             <wp:docPr id="105" name="Imagen 105"/>
@@ -27663,7 +27614,7 @@
           <w:noProof/>
         </w:rPr>
         <w:drawing>
-          <wp:inline distT="0" distB="0" distL="0" distR="0" wp14:anchorId="0B0CC78B" wp14:editId="044FDDC4">
+          <wp:inline distT="0" distB="0" distL="0" distR="0" wp14:anchorId="470667E3" wp14:editId="5BCC3C91">
             <wp:extent cx="1989666" cy="1894162"/>
             <wp:effectExtent l="19050" t="19050" r="10795" b="11430"/>
             <wp:docPr id="104" name="Imagen 104"/>
@@ -27734,7 +27685,7 @@
           <w:noProof/>
         </w:rPr>
         <w:drawing>
-          <wp:inline distT="0" distB="0" distL="0" distR="0" wp14:anchorId="06FB5982" wp14:editId="73A597A1">
+          <wp:inline distT="0" distB="0" distL="0" distR="0" wp14:anchorId="453C5CFE" wp14:editId="37C85FB4">
             <wp:extent cx="2041575" cy="1896533"/>
             <wp:effectExtent l="19050" t="19050" r="15875" b="27940"/>
             <wp:docPr id="103" name="Imagen 103"/>
@@ -27910,7 +27861,6 @@
           <w:lang w:val="es-ES"/>
         </w:rPr>
       </w:pPr>
-      <w:bookmarkStart w:id="31" w:name="_Toc181560505"/>
       <w:r>
         <w:rPr>
           <w:lang w:val="es-ES"/>
@@ -27925,6 +27875,7 @@
           <w:lang w:val="es-ES"/>
         </w:rPr>
       </w:pPr>
+      <w:bookmarkStart w:id="31" w:name="_Toc181571798"/>
       <w:r>
         <w:rPr>
           <w:lang w:val="es-ES"/>
@@ -28187,7 +28138,7 @@
           <w:noProof/>
         </w:rPr>
         <w:drawing>
-          <wp:inline distT="0" distB="0" distL="0" distR="0" wp14:anchorId="32B6FFAA" wp14:editId="317AE01F">
+          <wp:inline distT="0" distB="0" distL="0" distR="0" wp14:anchorId="1D0C57A8" wp14:editId="7D8B84A5">
             <wp:extent cx="2633134" cy="1942240"/>
             <wp:effectExtent l="19050" t="19050" r="15240" b="20320"/>
             <wp:docPr id="102" name="Imagen 102"/>
@@ -28258,7 +28209,7 @@
           <w:noProof/>
         </w:rPr>
         <w:drawing>
-          <wp:inline distT="0" distB="0" distL="0" distR="0" wp14:anchorId="51F4C40D" wp14:editId="361208CE">
+          <wp:inline distT="0" distB="0" distL="0" distR="0" wp14:anchorId="6C6CAC1E" wp14:editId="2013F69B">
             <wp:extent cx="1568097" cy="1930400"/>
             <wp:effectExtent l="19050" t="19050" r="13335" b="12700"/>
             <wp:docPr id="101" name="Imagen 101"/>
@@ -28370,7 +28321,7 @@
           <w:noProof/>
         </w:rPr>
         <w:drawing>
-          <wp:inline distT="0" distB="0" distL="0" distR="0" wp14:anchorId="6CE897C2" wp14:editId="3212CDE9">
+          <wp:inline distT="0" distB="0" distL="0" distR="0" wp14:anchorId="38E86DF4" wp14:editId="47CEF4B8">
             <wp:extent cx="2110740" cy="2127885"/>
             <wp:effectExtent l="19050" t="19050" r="22860" b="24765"/>
             <wp:docPr id="100" name="Imagen 100"/>
@@ -28441,7 +28392,7 @@
           <w:noProof/>
         </w:rPr>
         <w:drawing>
-          <wp:inline distT="0" distB="0" distL="0" distR="0" wp14:anchorId="167234CB" wp14:editId="36601EB9">
+          <wp:inline distT="0" distB="0" distL="0" distR="0" wp14:anchorId="698F10D5" wp14:editId="30859AFD">
             <wp:extent cx="2242951" cy="2125980"/>
             <wp:effectExtent l="19050" t="19050" r="24130" b="26670"/>
             <wp:docPr id="99" name="Imagen 99"/>
@@ -28615,7 +28566,7 @@
           <w:noProof/>
         </w:rPr>
         <w:drawing>
-          <wp:inline distT="0" distB="0" distL="0" distR="0" wp14:anchorId="208763EB" wp14:editId="0510F781">
+          <wp:inline distT="0" distB="0" distL="0" distR="0" wp14:anchorId="1097AD10" wp14:editId="25D6E76D">
             <wp:extent cx="5985933" cy="2999763"/>
             <wp:effectExtent l="19050" t="19050" r="15240" b="10160"/>
             <wp:docPr id="448" name="Imagen 448"/>
@@ -28685,7 +28636,7 @@
           <w:noProof/>
         </w:rPr>
         <w:drawing>
-          <wp:inline distT="0" distB="0" distL="0" distR="0" wp14:anchorId="76F3CE20" wp14:editId="02379FA9">
+          <wp:inline distT="0" distB="0" distL="0" distR="0" wp14:anchorId="4079054F" wp14:editId="7DCD70D3">
             <wp:extent cx="6080598" cy="3268133"/>
             <wp:effectExtent l="19050" t="19050" r="15875" b="27940"/>
             <wp:docPr id="449" name="Imagen 449"/>
@@ -28797,7 +28748,7 @@
           <w:noProof/>
         </w:rPr>
         <w:drawing>
-          <wp:inline distT="0" distB="0" distL="0" distR="0" wp14:anchorId="2AF4B797" wp14:editId="0933E13F">
+          <wp:inline distT="0" distB="0" distL="0" distR="0" wp14:anchorId="4D6E59A5" wp14:editId="1D71E6AF">
             <wp:extent cx="2229326" cy="1377950"/>
             <wp:effectExtent l="19050" t="19050" r="19050" b="12700"/>
             <wp:docPr id="453" name="Imagen 453"/>
@@ -28862,7 +28813,6 @@
         </w:rPr>
         <w:t>sobre aceleración cartesiana</w:t>
       </w:r>
-      <w:bookmarkStart w:id="32" w:name="_Toc181560506"/>
     </w:p>
     <w:p>
       <w:pPr>
@@ -28872,6 +28822,7 @@
           <w:lang w:val="es-ES"/>
         </w:rPr>
       </w:pPr>
+      <w:bookmarkStart w:id="32" w:name="_Toc181571799"/>
       <w:r>
         <w:rPr>
           <w:lang w:val="es-ES"/>
@@ -28905,15 +28856,7 @@
         <w:rPr>
           <w:lang w:val="es-ES"/>
         </w:rPr>
-        <w:t xml:space="preserve"> y el uso del método matricial para resolver la cinemática inversa permitieron construir un modelo cinemático preciso, fundamental para evaluar el desempeño del robot en su espacio de trabajo. Las trayectorias generadas mediante interpolaciones </w:t>
-      </w:r>
-      <w:bookmarkStart w:id="33" w:name="_GoBack"/>
-      <w:bookmarkEnd w:id="33"/>
-      <w:r>
-        <w:rPr>
-          <w:lang w:val="es-ES"/>
-        </w:rPr>
-        <w:t xml:space="preserve">de posiciones y orientaciones permiten una operación fluida en la simulación, respetando los límites de velocidad y controlando la orientación del efector final en cada punto de la trayectoria. La identificación y análisis de singularidades críticas permiten anticipar posibles limitaciones en un entorno de aplicación real, lo cual es esencial para mantener la precisión y seguridad en la operación. </w:t>
+        <w:t xml:space="preserve"> y el uso del método matricial para resolver la cinemática inversa permitieron construir un modelo cinemático preciso, fundamental para evaluar el desempeño del robot en su espacio de trabajo. Las trayectorias generadas mediante interpolaciones de posiciones y orientaciones permiten una operación fluida en la simulación, respetando los límites de velocidad y controlando la orientación del efector final en cada punto de la trayectoria. La identificación y análisis de singularidades críticas permiten anticipar posibles limitaciones en un entorno de aplicación real, lo cual es esencial para mantener la precisión y seguridad en la operación. </w:t>
       </w:r>
       <w:r>
         <w:rPr>
@@ -28950,7 +28893,7 @@
         <w:br w:type="page"/>
       </w:r>
     </w:p>
-    <w:bookmarkStart w:id="34" w:name="_Toc181560507" w:displacedByCustomXml="next"/>
+    <w:bookmarkStart w:id="33" w:name="_Toc181571800" w:displacedByCustomXml="next"/>
     <w:sdt>
       <w:sdtPr>
         <w:rPr>
@@ -28985,7 +28928,7 @@
             </w:rPr>
             <w:t>Bibliografía</w:t>
           </w:r>
-          <w:bookmarkEnd w:id="34"/>
+          <w:bookmarkEnd w:id="33"/>
         </w:p>
         <w:sdt>
           <w:sdtPr>
@@ -29226,7 +29169,7 @@
           <w:lang w:val="es-ES"/>
         </w:rPr>
       </w:pPr>
-      <w:bookmarkStart w:id="35" w:name="_Toc181560508"/>
+      <w:bookmarkStart w:id="34" w:name="_Toc181571801"/>
       <w:r>
         <w:rPr>
           <w:lang w:val="es-ES"/>
@@ -29234,40 +29177,40 @@
         <w:lastRenderedPageBreak/>
         <w:t>Anexos</w:t>
       </w:r>
+      <w:bookmarkEnd w:id="34"/>
+    </w:p>
+    <w:p>
+      <w:pPr>
+        <w:pStyle w:val="Ttulo2"/>
+        <w:rPr>
+          <w:lang w:val="es-ES"/>
+        </w:rPr>
+      </w:pPr>
+      <w:bookmarkStart w:id="35" w:name="_Toc181571802"/>
+      <w:r>
+        <w:rPr>
+          <w:lang w:val="es-ES"/>
+        </w:rPr>
+        <w:t xml:space="preserve">Anexo 1 – </w:t>
+      </w:r>
+      <w:proofErr w:type="spellStart"/>
+      <w:r>
+        <w:rPr>
+          <w:lang w:val="es-ES"/>
+        </w:rPr>
+        <w:t>Layout</w:t>
+      </w:r>
+      <w:proofErr w:type="spellEnd"/>
+      <w:r>
+        <w:rPr>
+          <w:lang w:val="es-ES"/>
+        </w:rPr>
+        <w:t xml:space="preserve"> de la Planta</w:t>
+      </w:r>
       <w:bookmarkEnd w:id="35"/>
     </w:p>
     <w:p>
       <w:pPr>
-        <w:pStyle w:val="Ttulo2"/>
-        <w:rPr>
-          <w:lang w:val="es-ES"/>
-        </w:rPr>
-      </w:pPr>
-      <w:bookmarkStart w:id="36" w:name="_Toc181560509"/>
-      <w:r>
-        <w:rPr>
-          <w:lang w:val="es-ES"/>
-        </w:rPr>
-        <w:t xml:space="preserve">Anexo 1 – </w:t>
-      </w:r>
-      <w:proofErr w:type="spellStart"/>
-      <w:r>
-        <w:rPr>
-          <w:lang w:val="es-ES"/>
-        </w:rPr>
-        <w:t>Layout</w:t>
-      </w:r>
-      <w:proofErr w:type="spellEnd"/>
-      <w:r>
-        <w:rPr>
-          <w:lang w:val="es-ES"/>
-        </w:rPr>
-        <w:t xml:space="preserve"> de la Planta</w:t>
-      </w:r>
-      <w:bookmarkEnd w:id="36"/>
-    </w:p>
-    <w:p>
-      <w:pPr>
         <w:jc w:val="center"/>
         <w:rPr>
           <w:lang w:val="es-ES"/>
@@ -29278,7 +29221,7 @@
           <w:noProof/>
         </w:rPr>
         <w:drawing>
-          <wp:inline distT="0" distB="0" distL="0" distR="0" wp14:anchorId="2654D9A6" wp14:editId="202E6BC8">
+          <wp:inline distT="0" distB="0" distL="0" distR="0" wp14:anchorId="35AB95F3" wp14:editId="12A464F8">
             <wp:extent cx="4238625" cy="2657475"/>
             <wp:effectExtent l="0" t="0" r="9525" b="9525"/>
             <wp:docPr id="40" name="Imagen 40"/>
@@ -29332,7 +29275,7 @@
           <w:noProof/>
         </w:rPr>
         <w:drawing>
-          <wp:inline distT="0" distB="0" distL="0" distR="0" wp14:anchorId="2FE98D28" wp14:editId="2DD90588">
+          <wp:inline distT="0" distB="0" distL="0" distR="0" wp14:anchorId="47C241D4" wp14:editId="026443A7">
             <wp:extent cx="3962400" cy="3390900"/>
             <wp:effectExtent l="0" t="0" r="0" b="0"/>
             <wp:docPr id="41" name="Imagen 41"/>
@@ -29387,7 +29330,7 @@
         </w:rPr>
         <w:lastRenderedPageBreak/>
         <w:drawing>
-          <wp:inline distT="0" distB="0" distL="0" distR="0" wp14:anchorId="79B60F9D" wp14:editId="5881F8BD">
+          <wp:inline distT="0" distB="0" distL="0" distR="0" wp14:anchorId="5B8404C7" wp14:editId="72B83F74">
             <wp:extent cx="3657600" cy="2486025"/>
             <wp:effectExtent l="0" t="0" r="0" b="9525"/>
             <wp:docPr id="42" name="Imagen 42"/>
@@ -29436,14 +29379,14 @@
           <w:lang w:val="es-ES"/>
         </w:rPr>
       </w:pPr>
-      <w:bookmarkStart w:id="37" w:name="_Toc181560510"/>
+      <w:bookmarkStart w:id="36" w:name="_Toc181571803"/>
       <w:r>
         <w:rPr>
           <w:lang w:val="es-ES"/>
         </w:rPr>
         <w:t>Anexo 2 – Máquina de gammagrafía</w:t>
       </w:r>
-      <w:bookmarkEnd w:id="37"/>
+      <w:bookmarkEnd w:id="36"/>
     </w:p>
     <w:p>
       <w:pPr>
@@ -29457,7 +29400,7 @@
           <w:noProof/>
         </w:rPr>
         <w:drawing>
-          <wp:inline distT="0" distB="0" distL="0" distR="0" wp14:anchorId="0D304A7F" wp14:editId="10A6A9D4">
+          <wp:inline distT="0" distB="0" distL="0" distR="0" wp14:anchorId="21672AF8" wp14:editId="0DE8403E">
             <wp:extent cx="5278697" cy="4113766"/>
             <wp:effectExtent l="0" t="0" r="0" b="1270"/>
             <wp:docPr id="43" name="Imagen 43"/>
@@ -29526,7 +29469,7 @@
           <w:lang w:val="es-ES"/>
         </w:rPr>
       </w:pPr>
-      <w:bookmarkStart w:id="38" w:name="_Toc181560511"/>
+      <w:bookmarkStart w:id="37" w:name="_Toc181571804"/>
       <w:r>
         <w:rPr>
           <w:lang w:val="es-ES"/>
@@ -29552,7 +29495,7 @@
         </w:rPr>
         <w:t>Contenedor  con pastilla</w:t>
       </w:r>
-      <w:bookmarkEnd w:id="38"/>
+      <w:bookmarkEnd w:id="37"/>
     </w:p>
     <w:p>
       <w:pPr>
@@ -29573,7 +29516,7 @@
           <w:noProof/>
         </w:rPr>
         <w:drawing>
-          <wp:inline distT="0" distB="0" distL="0" distR="0" wp14:anchorId="64CDECA0" wp14:editId="4AFBA252">
+          <wp:inline distT="0" distB="0" distL="0" distR="0" wp14:anchorId="21F53D54" wp14:editId="583E78D6">
             <wp:extent cx="2343150" cy="6019800"/>
             <wp:effectExtent l="0" t="0" r="0" b="0"/>
             <wp:docPr id="44" name="Imagen 44"/>
@@ -29636,7 +29579,7 @@
           <w:lang w:val="es-ES"/>
         </w:rPr>
       </w:pPr>
-      <w:bookmarkStart w:id="39" w:name="_Toc181560512"/>
+      <w:bookmarkStart w:id="38" w:name="_Toc181571805"/>
       <w:r>
         <w:rPr>
           <w:lang w:val="es-ES"/>
@@ -29644,7 +29587,7 @@
         <w:lastRenderedPageBreak/>
         <w:t>Anexo 4 – Mesa</w:t>
       </w:r>
-      <w:bookmarkEnd w:id="39"/>
+      <w:bookmarkEnd w:id="38"/>
     </w:p>
     <w:p>
       <w:pPr>
@@ -29658,7 +29601,7 @@
           <w:noProof/>
         </w:rPr>
         <w:drawing>
-          <wp:inline distT="0" distB="0" distL="0" distR="0" wp14:anchorId="328F08B8" wp14:editId="344E4805">
+          <wp:inline distT="0" distB="0" distL="0" distR="0" wp14:anchorId="6FAE81DB" wp14:editId="14B89FC7">
             <wp:extent cx="4362450" cy="3320032"/>
             <wp:effectExtent l="0" t="0" r="0" b="0"/>
             <wp:docPr id="45" name="Imagen 45"/>
@@ -29704,7 +29647,7 @@
           <w:noProof/>
         </w:rPr>
         <w:drawing>
-          <wp:inline distT="0" distB="0" distL="0" distR="0" wp14:anchorId="3A2DC51A" wp14:editId="08EF55C2">
+          <wp:inline distT="0" distB="0" distL="0" distR="0" wp14:anchorId="09D65A75" wp14:editId="7F58E0B7">
             <wp:extent cx="4391025" cy="3322542"/>
             <wp:effectExtent l="0" t="0" r="0" b="0"/>
             <wp:docPr id="46" name="Imagen 46"/>
@@ -29769,7 +29712,7 @@
           <w:lang w:val="es-ES"/>
         </w:rPr>
       </w:pPr>
-      <w:bookmarkStart w:id="40" w:name="_Toc181560513"/>
+      <w:bookmarkStart w:id="39" w:name="_Toc181571806"/>
       <w:r>
         <w:rPr>
           <w:lang w:val="es-ES"/>
@@ -29777,7 +29720,7 @@
         <w:lastRenderedPageBreak/>
         <w:t>Anexo 5 – Hoja de datos del Robot</w:t>
       </w:r>
-      <w:bookmarkEnd w:id="40"/>
+      <w:bookmarkEnd w:id="39"/>
     </w:p>
     <w:p>
       <w:pPr>
@@ -29804,7 +29747,7 @@
           <w:noProof/>
         </w:rPr>
         <w:drawing>
-          <wp:inline distT="0" distB="0" distL="0" distR="0" wp14:anchorId="60B9A8C0" wp14:editId="4D8BAD35">
+          <wp:inline distT="0" distB="0" distL="0" distR="0" wp14:anchorId="0FB1BEC0" wp14:editId="30EF7F60">
             <wp:extent cx="4093392" cy="4125433"/>
             <wp:effectExtent l="0" t="0" r="2540" b="8890"/>
             <wp:docPr id="519" name="Imagen 519"/>
@@ -29858,7 +29801,7 @@
           <w:noProof/>
         </w:rPr>
         <w:drawing>
-          <wp:inline distT="0" distB="0" distL="0" distR="0" wp14:anchorId="0280B3D5" wp14:editId="1E7FA33C">
+          <wp:inline distT="0" distB="0" distL="0" distR="0" wp14:anchorId="6EF6657B" wp14:editId="7DA01731">
             <wp:extent cx="4114800" cy="2049300"/>
             <wp:effectExtent l="0" t="0" r="0" b="8255"/>
             <wp:docPr id="520" name="Imagen 520"/>
@@ -29913,7 +29856,7 @@
           <w:lang w:val="es-ES"/>
         </w:rPr>
       </w:pPr>
-      <w:bookmarkStart w:id="41" w:name="_Toc181560514"/>
+      <w:bookmarkStart w:id="40" w:name="_Toc181571807"/>
       <w:r>
         <w:rPr>
           <w:lang w:val="es-ES"/>
@@ -29927,7 +29870,7 @@
         </w:rPr>
         <w:t xml:space="preserve"> – Definición del robot.</w:t>
       </w:r>
-      <w:bookmarkEnd w:id="41"/>
+      <w:bookmarkEnd w:id="40"/>
     </w:p>
     <w:p>
       <w:pPr>
@@ -33699,7 +33642,7 @@
           <w:lang w:val="es-AR" w:eastAsia="es-AR"/>
         </w:rPr>
       </w:pPr>
-      <w:bookmarkStart w:id="42" w:name="_Toc181560515"/>
+      <w:bookmarkStart w:id="41" w:name="_Toc181571808"/>
       <w:r>
         <w:rPr>
           <w:lang w:val="es-ES"/>
@@ -33712,7 +33655,7 @@
         </w:rPr>
         <w:t xml:space="preserve"> – Función de cinemática inversa</w:t>
       </w:r>
-      <w:bookmarkEnd w:id="42"/>
+      <w:bookmarkEnd w:id="41"/>
     </w:p>
     <w:p>
       <w:pPr>
@@ -48347,7 +48290,7 @@
           <w:lang w:val="es-AR"/>
         </w:rPr>
       </w:pPr>
-      <w:bookmarkStart w:id="43" w:name="_Toc181560516"/>
+      <w:bookmarkStart w:id="42" w:name="_Toc181571809"/>
       <w:r>
         <w:rPr>
           <w:lang w:val="es-AR"/>
@@ -48360,7 +48303,7 @@
         </w:rPr>
         <w:t xml:space="preserve"> – Trayectorias.</w:t>
       </w:r>
-      <w:bookmarkEnd w:id="43"/>
+      <w:bookmarkEnd w:id="42"/>
     </w:p>
     <w:p>
       <w:pPr>
@@ -49722,7 +49665,7 @@
         <w:szCs w:val="20"/>
         <w:lang w:val="es-ES"/>
       </w:rPr>
-      <w:t>28</w:t>
+      <w:t>21</w:t>
     </w:r>
     <w:r>
       <w:rPr>
@@ -52043,7 +51986,7 @@
 </file>
 
 <file path=customXml/itemProps1.xml><?xml version="1.0" encoding="utf-8"?>
-<ds:datastoreItem xmlns:ds="http://schemas.openxmlformats.org/officeDocument/2006/customXml" ds:itemID="{B3CC72CF-AE41-4C7C-9B00-074AECF0F35D}">
+<ds:datastoreItem xmlns:ds="http://schemas.openxmlformats.org/officeDocument/2006/customXml" ds:itemID="{F3AD7FDC-E208-49B9-852B-90130395D41B}">
   <ds:schemaRefs>
     <ds:schemaRef ds:uri="http://schemas.openxmlformats.org/officeDocument/2006/bibliography"/>
   </ds:schemaRefs>

</xml_diff>